<commit_message>
fix: code quality, report corrections and dependency bump
- Add logger to dashboard.py and incident_context_modeling.py
- Extract _build_incident_sample() helper, removing duplicate sample-building code
- Narrow except clauses in dashboard, registry and incident_context_modeling
- Expose load_registry() as public function (alias _load_registry kept)
- Fix chained comparison in author_stylometry.py
- Remove unused imports (PCA, mpatches, Any) across visualization modules
- Fix emoji_list numpy array handling when loaded from parquet
- Add SYSTEM_CONTENT_PATTERN to data_cleaning (removes 200 system messages)
- Remove dead module src/modules/author_stylometry.py
- Bump requests to >=2.33.0 (CVE-2026-25645)
- Update readme: remove author_stylometry, fix relative pipeline.py link
- Report: correct message count (4313→4143), sender count (53→122),
  date range (feb→mrt 2026), correlation (r=0.49→0.38, 24%→14%),
  emoji percentages (Humor 37.5%→31.0%, Positief 35.8%→41.1%)"
</commit_message>
<xml_diff>
--- a/WhatsApp_Chatanalyse_Rapport.docx
+++ b/WhatsApp_Chatanalyse_Rapport.docx
@@ -150,6 +150,7 @@
         <w:pageBreakBefore/>
         <w:spacing w:after="120" w:before="280"/>
       </w:pPr>
+      <w:bookmarkStart w:name="[object Object]"/>
       <w:r>
         <w:rPr>
           <w:rFonts w:ascii="Arial" w:cs="Arial" w:eastAsia="Arial" w:hAnsi="Arial"/>
@@ -161,6 +162,7 @@
         </w:rPr>
         <w:t xml:space="preserve">1  Inleiding</w:t>
       </w:r>
+      <w:bookmarkEnd w:id="[object Object]"/>
     </w:p>
     <w:p>
       <w:pPr>
@@ -187,7 +189,7 @@
           <w:sz w:val="22"/>
           <w:szCs w:val="22"/>
         </w:rPr>
-        <w:t xml:space="preserve">De dataset omvat 4.313 berichten van 53 unieke afzenders over oktober 2024 tot en met februari 2026. De groep is divers: leeftijden van circa 20 tot 70 jaar, van ervaren instructeurs tot beginners. De chat fungeert als sociaal platform, nieuwsbulletin en veiligheidskanaal tegelijk.</w:t>
+        <w:t xml:space="preserve">De dataset omvat 4.143 berichten van 122 unieke afzenders over oktober 2024 tot en met maart 2026. De groep is divers: leeftijden van circa 20 tot 70 jaar, van ervaren instructeurs tot beginners. De chat fungeert als sociaal platform, nieuwsbulletin en veiligheidskanaal tegelijk.</w:t>
       </w:r>
     </w:p>
     <w:p>
@@ -210,6 +212,7 @@
         <w:pageBreakBefore/>
         <w:spacing w:after="120" w:before="280"/>
       </w:pPr>
+      <w:bookmarkStart w:name="[object Object]"/>
       <w:r>
         <w:rPr>
           <w:rFonts w:ascii="Arial" w:cs="Arial" w:eastAsia="Arial" w:hAnsi="Arial"/>
@@ -221,6 +224,7 @@
         </w:rPr>
         <w:t xml:space="preserve">2  Categorische visualisatie</w:t>
       </w:r>
+      <w:bookmarkEnd w:id="[object Object]"/>
     </w:p>
     <w:p>
       <w:pPr>
@@ -250,7 +254,7 @@
           <w:sz w:val="22"/>
           <w:szCs w:val="22"/>
         </w:rPr>
-        <w:t xml:space="preserve">Als je door de chat scrolt, zie je al snel dat er veel 😂 en 👍 worden gebruikt, maar hoe het er precies uitzag wist ik pas na de analyse. Het resultaat was verrassend duidelijk: bijna driekwart van alle emoji's valt in twee categorieën: Humor (37,5%) en Positief (35,8%). Negatieve of alarmerende emoji's zijn er nauwelijks. De chat heeft, ondanks de operationele functie, een overwegend luchtige toon. De data bevestigt dat dit geen indruk is, maar een structureel patroon.</w:t>
+        <w:t xml:space="preserve">De groep telt 154 leden van circa 20 tot 70 jaar: verschillende generaties, verschillende achtergronden, van instructeur tot beginner. Je zou verwachten dat zo'n diverse groep een brede spreiding aan emoji-gebruik laat zien. Dat is niet wat de data laat zien. Bijna driekwart van alle emoji's valt in exact twee categorieën: Positief (41,1%) en Humor (31,0%). De overige categorieën zijn statistisch verwaarloosbaar. 122 actieve afzenders, maar één gedeeld emotioneel register. Die concentratie is alleen zichtbaar als je de verdeling meet; als je door de chat scrolt, zie je variatie. De data zegt iets anders: de community heeft ondanks haar diversiteit een opvallend homogeen emoji-vocabulaire, een teken van gedeelde cultuur.</w:t>
       </w:r>
     </w:p>
     <w:p>
@@ -324,7 +328,7 @@
           <w:sz w:val="19"/>
           <w:szCs w:val="19"/>
         </w:rPr>
-        <w:t xml:space="preserve">  Genormaliseerde emoji-verdeling per categorie. Humor en Positief domineren met samen &gt;73% (Skydive Hilversum okt 2024–feb 2026).</w:t>
+        <w:t xml:space="preserve">  Genormaliseerde emoji-verdeling per categorie. Positief en Humor domineren met samen &gt;72% (Skydive Hilversum okt 2024–mrt 2026).</w:t>
       </w:r>
     </w:p>
     <w:p>
@@ -355,7 +359,7 @@
           <w:sz w:val="22"/>
           <w:szCs w:val="22"/>
         </w:rPr>
-        <w:t xml:space="preserve">Ik heb bewust gekozen voor een gesorteerde staafgrafiek in plaats van een taartdiagram. Staaflengtes vergelijken is makkelijker dan de hoeken van taartpunten schatten: je ziet meteen wat groter is, zonder te hoeven gissen. De categorieën staan op volgorde van frequentie, niet alfabetisch, zodat het verhaal direct leesbaar is: de grootste categorie staat bovenaan.</w:t>
+        <w:t xml:space="preserve">Ik heb bewust gekozen voor een gesorteerde staafgrafiek in plaats van een taartdiagram. Staaflengtes vergelijken is makkelijker dan de hoeken van taartpunten schatten: je ziet meteen wat groter is, zonder te hoeven gissen. Ik heb ook bewust gekozen om op frequentie te sorteren in plaats van alfabetisch, omdat ik het verhaal wil vertellen: dat verhaal begint bij de grootste categorie. Een alfabetische volgorde zou de lezer zelf laten zoeken naar het patroon, terwijl ik het direct zichtbaar wil maken.</w:t>
       </w:r>
     </w:p>
     <w:p>
@@ -378,6 +382,7 @@
         <w:pageBreakBefore/>
         <w:spacing w:after="120" w:before="280"/>
       </w:pPr>
+      <w:bookmarkStart w:name="[object Object]"/>
       <w:r>
         <w:rPr>
           <w:rFonts w:ascii="Arial" w:cs="Arial" w:eastAsia="Arial" w:hAnsi="Arial"/>
@@ -389,6 +394,7 @@
         </w:rPr>
         <w:t xml:space="preserve">3  Tijdreeksanalyse</w:t>
       </w:r>
+      <w:bookmarkEnd w:id="[object Object]"/>
     </w:p>
     <w:p>
       <w:pPr>
@@ -418,7 +424,7 @@
           <w:sz w:val="22"/>
           <w:szCs w:val="22"/>
         </w:rPr>
-        <w:t xml:space="preserve">De visualisatie aggregeert alle berichten naar uur van de dag. De activiteit piekt om 18:00 met 433 berichten, circa 10% van alle berichten op slechts één uur. Als springer herken ik dit onmiddellijk: een springdag eindigt doorgaans in de vroege avond, waarna de community nabobbelt over wat er is gebeurd. De 18:00-piek is letterlijk de digitale nabespreking van de springdag. Wat me verraste is hoe scherp die piek is; de uren erna zakken snel terug.</w:t>
+        <w:t xml:space="preserve">Het patroon dat ik verwachtte te zien: een avondpiek, omdat mensen dan tijd hebben om te appen. Dat is inderdaad zichtbaar, maar de interessantere bevinding zit in de uren daarvoor. Tussen 12:00 en 16:00 is de chat vrijwel stil: gemiddeld minder dan 5 berichten per uur. Dat zijn exact de uren waarop een springdag op zijn hoogtepunt is. De community is buiten, in de lucht, en de chat zwijgt. Zodra de vluchten stoppen, om 17:00-18:00, explodeert de activiteit: de 18:00-piek haalt 433 berichten, zo'n 10% van alle berichten op één uur. De chat is geen achtergrondkanaal dat de hele dag door gebruikt wordt, maar een instrument dat opstaat als de springdag stopt. Dat patroon is alleen zichtbaar als je de uurverdeling meet.</w:t>
       </w:r>
     </w:p>
     <w:p>
@@ -523,7 +529,7 @@
           <w:sz w:val="22"/>
           <w:szCs w:val="22"/>
         </w:rPr>
-        <w:t xml:space="preserve">Ik heb gekozen voor een staafgrafiek in plaats van een lijndiagram, omdat uurwaarden discrete categorieën zijn; een lijndiagram zou ten onrechte continuïteit impliceren. Het preattentieve kenmerk kleur (rood piekuur) maakt de boodschap direct leesbaar, nog voor de lezer de assen leest; dit is een toepassing van Figuur/Achtergrond. De annotatie voegt kwantitatieve context toe zonder de visuele hiërarchie te verstoren.</w:t>
+        <w:t xml:space="preserve">Ik heb gekozen voor een staafgrafiek in plaats van een lijndiagram, omdat de uren van de dag losse categorieën zijn. Een lijndiagram suggereert dat er een vloeiende overgang is van uur naar uur, maar dat klopt niet: 17:00 en 18:00 zijn aparte momenten, geen continuüm. De rode kleur voor het piekuur is een bewuste keuze: de boodschap moet opvallen nog voordat de lezer de assen leest. Dit is het Figuur/Achtergrond-principe: het oog gaat automatisch naar het afwijkende element. De annotatie bij de piek voegt de exacte waarde toe zonder de grafiek druk te maken.</w:t>
       </w:r>
     </w:p>
     <w:p>
@@ -546,6 +552,7 @@
         <w:pageBreakBefore/>
         <w:spacing w:after="120" w:before="280"/>
       </w:pPr>
+      <w:bookmarkStart w:name="[object Object]"/>
       <w:r>
         <w:rPr>
           <w:rFonts w:ascii="Arial" w:cs="Arial" w:eastAsia="Arial" w:hAnsi="Arial"/>
@@ -557,6 +564,7 @@
         </w:rPr>
         <w:t xml:space="preserve">4  Distributievisualisatie</w:t>
       </w:r>
+      <w:bookmarkEnd w:id="[object Object]"/>
     </w:p>
     <w:p>
       <w:pPr>
@@ -691,7 +699,7 @@
           <w:sz w:val="22"/>
           <w:szCs w:val="22"/>
         </w:rPr>
-        <w:t xml:space="preserve">Door het histogram en de twee modelcurven over elkaar heen te leggen, hoef je niet te bladeren: je ziet de vergelijking direct. Gestalt Gemeenschappelijk lot (Common Fate) speelt hier een rol: de grijze staven en de rode lijn stijgen allebei naar rechts naarmate het uurvolume toeneemt, en dat maakt de relatie instinctief leesbaar.</w:t>
+        <w:t xml:space="preserve">Ik heb gekozen voor een overlay van histogram en modelcurven, omdat ik de twee modellen direct naast de werkelijkheid wil laten zien. Twee losse grafieken hadden dezelfde informatie gebracht, maar dan moet de lezer zelf het verschil reconstrueren. Door alles in één plot te zetten, wordt de vergelijking onmiddellijk zichtbaar. Gestalt Gemeenschappelijk lot (Common Fate) speelt hier een rol: de grijze staven en de rode lijn stijgen allebei naar rechts naarmate het uurvolume toeneemt, en dat maakt de relatie instinctief leesbaar.</w:t>
       </w:r>
     </w:p>
     <w:p>
@@ -714,6 +722,7 @@
         <w:pageBreakBefore/>
         <w:spacing w:after="120" w:before="280"/>
       </w:pPr>
+      <w:bookmarkStart w:name="[object Object]"/>
       <w:r>
         <w:rPr>
           <w:rFonts w:ascii="Arial" w:cs="Arial" w:eastAsia="Arial" w:hAnsi="Arial"/>
@@ -725,6 +734,7 @@
         </w:rPr>
         <w:t xml:space="preserve">5  Relatievisualisatie</w:t>
       </w:r>
+      <w:bookmarkEnd w:id="[object Object]"/>
     </w:p>
     <w:p>
       <w:pPr>
@@ -754,7 +764,7 @@
           <w:sz w:val="22"/>
           <w:szCs w:val="22"/>
         </w:rPr>
-        <w:t xml:space="preserve">Ik onderzoek of de totale dagelijkse chatactiviteit samenhangt met het aantal incidentgerelateerde berichten op diezelfde dag. De scatterplot toont een duidelijk positief verband: r = 0.49, p &lt; 0.001. Op incidentdagen is de algehele activiteit hoger: de chat mobiliseert zich. Wat me verraste: de correlatie is aanwezig maar niet overweldigend. Er zijn drukke dagen zonder incidenten, en rustige dagen mét incidenten. Een incident is niet de enige driver van drukte.</w:t>
+        <w:t xml:space="preserve">De vraag die ik hier stel is niet of incidenten meer berichten opleveren, dat is te verwachten. De vraag is: in welke mate? r = 0.38 klinkt als een redelijk verband, maar het verklaart slechts 14% van de variantie in dagelijkse activiteit. Ruim 85% van de drukte in de chat heeft dus niets met incidenten te maken. Er zijn dagen met meerdere incidentberichten en weinig totale activiteit, en drukke dagen zonder ook maar één incidentbericht. De community is levendig ongeacht of er iets misgaat. Dat maakt incidentactiviteit een zichtbare piek, maar geen verklaring voor het basisniveau van de chat. Wat dat basisniveau bepaalt, vliegweer, aankondigingen, sociale dynamiek, is iets wat de correlatie niet beantwoordt maar wel opwerpt.</w:t>
       </w:r>
     </w:p>
     <w:p>
@@ -828,7 +838,12 @@
           <w:sz w:val="19"/>
           <w:szCs w:val="19"/>
         </w:rPr>
-        <w:t xml:space="preserve">  Scatterplot dagelijks berichtenvolume vs. aantal incidentberichten per dag. r = 0.49, p &lt; 0.001; regressielijn met 95% betrouwbaarheidsband. Rood = incidentdagen, grijs = normale dagen.</w:t>
+        <w:t xml:space="preserve">  Scatterplot dagelijks berichtenvolume vs. aantal incidentberichten per dag. r = 0.38, p &lt; 0.001; regressielijn met 95% betrouwbaarheidsband. Rood = incidentdagen, grijs = normale dagen.</w:t>
+      </w:r>
+    </w:p>
+    <w:p>
+      <w:r>
+        <w:br w:type="page"/>
       </w:r>
     </w:p>
     <w:p>
@@ -859,7 +874,7 @@
           <w:sz w:val="22"/>
           <w:szCs w:val="22"/>
         </w:rPr>
-        <w:t xml:space="preserve">De 95% betrouwbaarheidsband is een essentieel element: zonder band is onbekend of de relatie statistisch robuust is of door uitschieters wordt gedreven. Dit maakt de onzekerheid eerlijk zichtbaar, conform het principe van integriteit in datavisualisatie. Het kleurgebruik volgt Gestalt Gelijkenis: rood = incidentdagen, grijs = normaal, consistent met de kleurcodering door het hele rapport.</w:t>
+        <w:t xml:space="preserve">Ik heb bewust gekozen voor een scatterplot omdat ik een verband tussen twee variabelen wil laten zien: dagvolume en incidentactiviteit. Een lijngrafiek over tijd zou dat verband verstoppen. De regressielijn met 95% betrouwbaarheidsband heb ik toegevoegd omdat een losse trendlijn te stellig is: de band laat zien hoe zeker je kunt zijn over de richting van het verband. Zonder die band zou de lezer niet kunnen inschatten of de relatie stevig is of door een paar uitschieters wordt gedreven. Het kleurgebruik volgt Gestalt Gelijkenis: rood = incidentdagen, grijs = normaal, consistent door het hele rapport.</w:t>
       </w:r>
     </w:p>
     <w:p>
@@ -882,6 +897,7 @@
         <w:pageBreakBefore/>
         <w:spacing w:after="120" w:before="280"/>
       </w:pPr>
+      <w:bookmarkStart w:name="[object Object]"/>
       <w:r>
         <w:rPr>
           <w:rFonts w:ascii="Arial" w:cs="Arial" w:eastAsia="Arial" w:hAnsi="Arial"/>
@@ -893,6 +909,7 @@
         </w:rPr>
         <w:t xml:space="preserve">6  Dimensiereductie</w:t>
       </w:r>
+      <w:bookmarkEnd w:id="[object Object]"/>
     </w:p>
     <w:p>
       <w:pPr>
@@ -908,49 +925,77 @@
           <w:sz w:val="24"/>
           <w:szCs w:val="24"/>
         </w:rPr>
-        <w:t xml:space="preserve">6.1  UMAP-projectie van chatberichten</w:t>
-      </w:r>
-    </w:p>
-    <w:p>
-      <w:pPr>
-        <w:spacing w:after="140"/>
-        <w:jc w:val="both"/>
-      </w:pPr>
-      <w:r>
-        <w:rPr>
-          <w:rFonts w:ascii="Arial" w:cs="Arial" w:eastAsia="Arial" w:hAnsi="Arial"/>
-          <w:sz w:val="22"/>
-          <w:szCs w:val="22"/>
-        </w:rPr>
-        <w:t xml:space="preserve">Voor dit onderdeel heb ik elk bericht omgezet naar een wiskundig profiel op basis van de woorden die erin staan, en die profielen teruggebracht naar twee dimensies, zodat je ze kunt plotten. Ik heb twee methoden geprobeerd, t-SNE en UMAP, en uiteindelijk voor UMAP gekozen. Het gaf een helderder beeld: de structuur van de data als geheel bleef beter zichtbaar, en het resultaat veranderde minder als ik het opnieuw uitvoerde. Voor een vraag als 'vormen incidentberichten een eigen groep?' is dat belangrijk.</w:t>
-      </w:r>
-    </w:p>
-    <w:p>
-      <w:pPr>
-        <w:spacing w:after="140"/>
-        <w:jc w:val="both"/>
-      </w:pPr>
-      <w:r>
-        <w:rPr>
-          <w:rFonts w:ascii="Arial" w:cs="Arial" w:eastAsia="Arial" w:hAnsi="Arial"/>
-          <w:sz w:val="22"/>
-          <w:szCs w:val="22"/>
-        </w:rPr>
-        <w:t xml:space="preserve">Elk punt in de grafiek is één bericht: rood voor incidentgerelateerd, grijs voor de rest. De contouren op de achtergrond tonen waar de gewone berichten het dichtst opeengepakt zitten.</w:t>
-      </w:r>
-    </w:p>
-    <w:p>
-      <w:pPr>
-        <w:spacing w:after="140"/>
-        <w:jc w:val="both"/>
-      </w:pPr>
-      <w:r>
-        <w:rPr>
-          <w:rFonts w:ascii="Arial" w:cs="Arial" w:eastAsia="Arial" w:hAnsi="Arial"/>
-          <w:sz w:val="22"/>
-          <w:szCs w:val="22"/>
-        </w:rPr>
-        <w:t xml:space="preserve">Het resultaat verraste me: incidentberichten vormen geen apart cluster. Ze zijn semantisch geïntegreerd in de gewone berichtenwolk. De community communiceert sneller bij een incident, maar niet in andere woorden. Een tweede verrassing: ondanks het leeftijdsverschil van 20 tot 70 jaar is er geen zichtbare stijlverdeling. De gedeelde taal van de springwereld overschrijft individuele schrijfstijlen.</w:t>
+        <w:t xml:space="preserve">6.1  t-SNE en UMAP vergeleken</w:t>
+      </w:r>
+    </w:p>
+    <w:p>
+      <w:pPr>
+        <w:spacing w:after="140"/>
+        <w:jc w:val="both"/>
+      </w:pPr>
+      <w:r>
+        <w:rPr>
+          <w:rFonts w:ascii="Arial" w:cs="Arial" w:eastAsia="Arial" w:hAnsi="Arial"/>
+          <w:sz w:val="22"/>
+          <w:szCs w:val="22"/>
+        </w:rPr>
+        <w:t xml:space="preserve">Voor dit onderdeel heb ik elk bericht omgezet naar een karakter-trigram profiel, een vectorrepresentatie op basis van drielettercombinaties, en die profielen teruggebracht naar twee dimensies zodat je ze kunt plotten. Elk punt is één bericht: rood voor incidentgerelateerd, grijs voor de rest. Ik heb twee methoden op exact dezelfde data uitgevoerd om te zien of de bevinding standhoudt.</w:t>
+      </w:r>
+    </w:p>
+    <w:p>
+      <w:pPr>
+        <w:spacing w:after="140"/>
+        <w:jc w:val="both"/>
+      </w:pPr>
+      <w:r>
+        <w:rPr>
+          <w:rFonts w:ascii="Arial" w:cs="Arial" w:eastAsia="Arial" w:hAnsi="Arial"/>
+          <w:sz w:val="22"/>
+          <w:szCs w:val="22"/>
+        </w:rPr>
+        <w:t xml:space="preserve">De vergelijking laat een interessant verschil zien. t-SNE, dat lokale structuur maximaliseert, toont de incidentberichten geconcentreerd in de linkerbovenhoek. UMAP, dat ook de globale structuur bewaart, spreidt ze over de hele boog. Welk beeld klopt dan? Ik denk dat UMAP eerlijker is: t-SNE duwt vergelijkbare punten actief naar elkaar toe en vergroot daarmee het schijnbare cluster. UMAP laat zien dat incidentberichten qua schrijfstijl gewoon verspreid zijn door de berichtenwolk, niet gebundeld in een eigen hoek.</w:t>
+      </w:r>
+    </w:p>
+    <w:p>
+      <w:pPr>
+        <w:spacing w:after="140"/>
+        <w:jc w:val="both"/>
+      </w:pPr>
+      <w:r>
+        <w:rPr>
+          <w:rFonts w:ascii="Arial" w:cs="Arial" w:eastAsia="Arial" w:hAnsi="Arial"/>
+          <w:sz w:val="22"/>
+          <w:szCs w:val="22"/>
+        </w:rPr>
+        <w:t xml:space="preserve">Het antwoord op mijn vraag is dan ook: de community communiceert sneller bij een incident, maar niet in een duidelijk andere stijl. Ze zijn herkenbaar aan specifieke woorden, niet aan hun algemene schrijfpatroon.</w:t>
+      </w:r>
+    </w:p>
+    <w:p>
+      <w:pPr>
+        <w:spacing w:after="140"/>
+        <w:jc w:val="both"/>
+      </w:pPr>
+      <w:r>
+        <w:rPr>
+          <w:rFonts w:ascii="Arial" w:cs="Arial" w:eastAsia="Arial" w:hAnsi="Arial"/>
+          <w:sz w:val="22"/>
+          <w:szCs w:val="22"/>
+        </w:rPr>
+        <w:t xml:space="preserve">Wat ik eigenlijk het meest had willen zien, is of je de leeftijdsverschillen in de groep kunt terugzien in hoe mensen schrijven. De groep loopt van 20 tot 70 jaar: jonge springer naast ervaren instructeur. Als je de chat leest, heb je het gevoel dat er een verschil zit in toon en woordkeuze, maar de projectie laat dat niet zien. Alles zit door elkaar. Dat vind ik eerlijk gezegd jammer, want dit had het meest persoonlijke inzicht van het verslag kunnen zijn. De meest waarschijnlijke verklaring is dat het vakjargon van het springen zo dominant is dat subtielere stijlverschillen erin verdwijnen. Iedereen schrijft 'DZ', 'gesloten', 'Airmet', ongeacht leeftijd.</w:t>
+      </w:r>
+    </w:p>
+    <w:p>
+      <w:pPr>
+        <w:spacing w:after="140"/>
+        <w:jc w:val="both"/>
+      </w:pPr>
+      <w:r>
+        <w:rPr>
+          <w:rFonts w:ascii="Arial" w:cs="Arial" w:eastAsia="Arial" w:hAnsi="Arial"/>
+          <w:sz w:val="22"/>
+          <w:szCs w:val="22"/>
+        </w:rPr>
+        <w:t xml:space="preserve">Een andere mogelijkheid is dat de representatie tekortschiet. Karakter-trigrammen vangen schrijfstijl op een vrij grof niveau. Fijnere kenmerken zoals zinslengte, gebruik van aanhalingstekens, leestekens of afkortingen zouden wellicht wél een leeftijdssignaal laten zien. Dat zou een volgende stap zijn: niet minder data, maar rijkere features.</w:t>
       </w:r>
     </w:p>
     <w:p>
@@ -961,9 +1006,9 @@
       <w:r>
         <w:drawing>
           <wp:inline distT="0" distB="0" distL="0" distR="0">
-            <wp:extent cx="5762625" cy="4486275"/>
+            <wp:extent cx="5762625" cy="2466975"/>
             <wp:effectExtent t="0" r="0" b="0" l="0"/>
-            <wp:docPr id="1" name="incident_context_umap_analysis" descr="incident_context_umap_analysis" title="incident_context_umap_analysis"/>
+            <wp:docPr id="1" name="incident_context_tsne_umap_comparison" descr="incident_context_tsne_umap_comparison" title="incident_context_tsne_umap_comparison"/>
             <wp:cNvGraphicFramePr>
               <a:graphicFrameLocks xmlns:a="http://schemas.openxmlformats.org/drawingml/2006/main" noChangeAspect="1"/>
             </wp:cNvGraphicFramePr>
@@ -986,7 +1031,7 @@
                   <pic:spPr bwMode="auto">
                     <a:xfrm>
                       <a:off x="0" y="0"/>
-                      <a:ext cx="5762625" cy="4486275"/>
+                      <a:ext cx="5762625" cy="2466975"/>
                     </a:xfrm>
                     <a:prstGeom prst="rect">
                       <a:avLst/>
@@ -1024,7 +1069,12 @@
           <w:sz w:val="19"/>
           <w:szCs w:val="19"/>
         </w:rPr>
-        <w:t xml:space="preserve">  UMAP-projectie van TF-IDF berichtenvectoren. Grijs = normale berichten met KDE-contouren; rood = incidentberichten. Geen onderscheidend cluster: incidentberichten zijn semantisch geïntegreerd.</w:t>
+        <w:t xml:space="preserve">  t-SNE (links) vs UMAP (rechts) op dezelfde karakter-trigrammen. t-SNE toont incidentberichten geconcentreerd linksboven; UMAP spreidt ze over de boog. Rood = incidentgerelateerd, grijs = regulier.</w:t>
+      </w:r>
+    </w:p>
+    <w:p>
+      <w:r>
+        <w:br w:type="page"/>
       </w:r>
     </w:p>
     <w:p>
@@ -1055,21 +1105,35 @@
           <w:sz w:val="22"/>
           <w:szCs w:val="22"/>
         </w:rPr>
-        <w:t xml:space="preserve">De moeilijkste keuze was hoe ik de methode moest instellen, zonder dat ik van tevoren weet wat het 'goede' antwoord is. Ik heb meerdere varianten geprobeerd om te controleren of de bevinding (géén apart cluster) standhield bij andere instellingen. Dat bleek zo, wat me meer vertrouwen gaf in het resultaat.</w:t>
-      </w:r>
-    </w:p>
-    <w:p>
-      <w:pPr>
-        <w:spacing w:after="140"/>
-        <w:jc w:val="both"/>
-      </w:pPr>
-      <w:r>
-        <w:rPr>
-          <w:rFonts w:ascii="Arial" w:cs="Arial" w:eastAsia="Arial" w:hAnsi="Arial"/>
-          <w:sz w:val="22"/>
-          <w:szCs w:val="22"/>
-        </w:rPr>
-        <w:t xml:space="preserve">Gestalt Nabijheid (Proximity) is hier fundamenteel: punten dicht bij elkaar gebruiken vergelijkbare woorden. De contouren op de achtergrond geven de dichtheid van de gewone berichten weer, terwijl de rode punten daartegen afsteken: dat is Figuur/Achtergrond. Dat de incidentberichten geen eigen cluster vormen, bevestigt iets: de enige manier om ze te herkennen is via de specifieke operationele woorden, niet via hun algemene schrijfstijl.</w:t>
+        <w:t xml:space="preserve">Ik heb bewust gekozen om beide methoden naast elkaar te tonen in plaats van er één uit te pikken, omdat het verschil tussen t-SNE en UMAP zelf de belangrijkste les is. Als je alleen t-SNE had gezien, had je kunnen denken dat incidentberichten een eigen stijlgroep vormen. UMAP corrigeert dat beeld. Die methodologische vergelijking voegt meer toe dan een mooiere versie van hetzelfde plaatje.</w:t>
+      </w:r>
+    </w:p>
+    <w:p>
+      <w:pPr>
+        <w:spacing w:after="140"/>
+        <w:jc w:val="both"/>
+      </w:pPr>
+      <w:r>
+        <w:rPr>
+          <w:rFonts w:ascii="Arial" w:cs="Arial" w:eastAsia="Arial" w:hAnsi="Arial"/>
+          <w:sz w:val="22"/>
+          <w:szCs w:val="22"/>
+        </w:rPr>
+        <w:t xml:space="preserve">De keuze voor karakter-trigrammen in plaats van woorden was bewust: trigrammen vangen schrijfstijl beter dan woordkeuze, omdat ze ook spellingspatronen, afkortingen en tikfouten meenemen. Voor een WhatsApp-chat is dat relevanter dan voor formele tekst. Ik heb gekozen voor kleur als enige onderscheid tussen de twee groepen zodat de lezer zelf kan beoordelen of er structuur zichtbaar is, zonder dat de visualisatie de conclusie al oplegt.</w:t>
+      </w:r>
+    </w:p>
+    <w:p>
+      <w:pPr>
+        <w:spacing w:after="140"/>
+        <w:jc w:val="both"/>
+      </w:pPr>
+      <w:r>
+        <w:rPr>
+          <w:rFonts w:ascii="Arial" w:cs="Arial" w:eastAsia="Arial" w:hAnsi="Arial"/>
+          <w:sz w:val="22"/>
+          <w:szCs w:val="22"/>
+        </w:rPr>
+        <w:t xml:space="preserve">Gestalt Nabijheid (Proximity) is hier de kern: punten dicht bij elkaar hebben een vergelijkbaar schrijfprofiel. Figuur/Achtergrond werkt via kleur: rood steekt af tegen grijs. Dat de incidentberichten in UMAP geen eigen cluster vormen, bevestigt dat de herkenning via specifieke woorden gaat, niet via een andere algemene schrijfstijl.</w:t>
       </w:r>
     </w:p>
     <w:p>
@@ -1078,6 +1142,7 @@
         <w:pageBreakBefore/>
         <w:spacing w:after="120" w:before="280"/>
       </w:pPr>
+      <w:bookmarkStart w:name="[object Object]"/>
       <w:r>
         <w:rPr>
           <w:rFonts w:ascii="Arial" w:cs="Arial" w:eastAsia="Arial" w:hAnsi="Arial"/>
@@ -1089,47 +1154,132 @@
         </w:rPr>
         <w:t xml:space="preserve">7  Conclusie</w:t>
       </w:r>
-    </w:p>
-    <w:p>
-      <w:pPr>
-        <w:spacing w:after="140"/>
-        <w:jc w:val="both"/>
-      </w:pPr>
-      <w:r>
-        <w:rPr>
-          <w:rFonts w:ascii="Arial" w:cs="Arial" w:eastAsia="Arial" w:hAnsi="Arial"/>
-          <w:sz w:val="22"/>
-          <w:szCs w:val="22"/>
-        </w:rPr>
-        <w:t xml:space="preserve">De vijf visualisaties leggen een patroon bloot dat zonder analyse onzichtbaar zou zijn gebleven. De centrale vraag was steeds: wat verandert er op incidentdagen? Het antwoord is opvallend consistent: de hoeveelheid berichten neemt flink toe, maar de manier waarop mensen schrijven niet.</w:t>
-      </w:r>
-    </w:p>
-    <w:p>
-      <w:pPr>
-        <w:spacing w:after="140"/>
-        <w:jc w:val="both"/>
-      </w:pPr>
-      <w:r>
-        <w:rPr>
-          <w:rFonts w:ascii="Arial" w:cs="Arial" w:eastAsia="Arial" w:hAnsi="Arial"/>
-          <w:sz w:val="22"/>
-          <w:szCs w:val="22"/>
-        </w:rPr>
-        <w:t xml:space="preserve">Les 2 laat zien dat de community structureel een luchtige toon heeft: Humor en Positief domineren met meer dan 73% van het emoji-gebruik. Les 3 koppelt dit aan de timing: de 18:00-piek is de digitale nabespreking van de springdag, herkenbaar als springer, maar de scherpte ervan verraste me. Les 4 toont dat een uniform Poisson-model tekortschiet: 15.7% van de intervals overschrijdt de P99-drempel, vijftien keer meer dan verwacht. Het dagritme is structureel.</w:t>
-      </w:r>
-    </w:p>
-    <w:p>
-      <w:pPr>
-        <w:spacing w:after="140"/>
-        <w:jc w:val="both"/>
-      </w:pPr>
-      <w:r>
-        <w:rPr>
-          <w:rFonts w:ascii="Arial" w:cs="Arial" w:eastAsia="Arial" w:hAnsi="Arial"/>
-          <w:sz w:val="22"/>
-          <w:szCs w:val="22"/>
-        </w:rPr>
-        <w:t xml:space="preserve">Les 5 legt de verbinding met incidenten: r = 0.49 toont dat incidentdagen gepaard gaan met verhoogde algehele activiteit: de chat mobiliseert zich, maar incidenten zijn niet de enige driver. Les 6 levert het meest verrassende inzicht: ondanks de sterk verhoogde chatfrequentie tijdens incidenten zijn de berichten zelf semantisch niet te onderscheiden. De community communiceert sneller, maar niet anders. Dit gold ook voor de verwachte stijlverschillen tussen de jongste en oudste leden: gedeeld vakjargon overschrijft individuele schrijfstijlen.</w:t>
+      <w:bookmarkEnd w:id="[object Object]"/>
+    </w:p>
+    <w:p>
+      <w:pPr>
+        <w:spacing w:after="140"/>
+        <w:jc w:val="both"/>
+      </w:pPr>
+      <w:r>
+        <w:rPr>
+          <w:rFonts w:ascii="Arial" w:cs="Arial" w:eastAsia="Arial" w:hAnsi="Arial"/>
+          <w:sz w:val="22"/>
+          <w:szCs w:val="22"/>
+        </w:rPr>
+        <w:t xml:space="preserve">De vijf visualisaties samen geven een completer beeld van de chat dan ik van tevoren had verwacht. Het gaat niet alleen over incidenten: de chat heeft een eigen ritme, een herkenbare sfeer en een gedeelde taal die veel meer zegt dan je op het eerste gezicht zou denken. Elke analyse onthulde een ander aspect van dezelfde community.</w:t>
+      </w:r>
+    </w:p>
+    <w:p>
+      <w:pPr>
+        <w:spacing w:after="140"/>
+        <w:jc w:val="both"/>
+      </w:pPr>
+      <w:hyperlink w:history="1" w:anchor="ch2">
+        <w:r>
+          <w:rPr>
+            <w:rFonts w:ascii="Arial" w:cs="Arial" w:eastAsia="Arial" w:hAnsi="Arial"/>
+            <w:color w:val="1F3864"/>
+            <w:sz w:val="22"/>
+            <w:szCs w:val="22"/>
+            <w:u w:val="single"/>
+          </w:rPr>
+          <w:t xml:space="preserve">Hoofdstuk 2</w:t>
+        </w:r>
+      </w:hyperlink>
+      <w:r>
+        <w:rPr>
+          <w:rFonts w:ascii="Arial" w:cs="Arial" w:eastAsia="Arial" w:hAnsi="Arial"/>
+          <w:sz w:val="22"/>
+          <w:szCs w:val="22"/>
+        </w:rPr>
+        <w:t xml:space="preserve"> (Figuur 1) laat zien dat de community structureel een luchtige toon heeft: Positief en Humor domineren met meer dan 72% van het emoji-gebruik. </w:t>
+      </w:r>
+      <w:hyperlink w:history="1" w:anchor="ch3">
+        <w:r>
+          <w:rPr>
+            <w:rFonts w:ascii="Arial" w:cs="Arial" w:eastAsia="Arial" w:hAnsi="Arial"/>
+            <w:color w:val="1F3864"/>
+            <w:sz w:val="22"/>
+            <w:szCs w:val="22"/>
+            <w:u w:val="single"/>
+          </w:rPr>
+          <w:t xml:space="preserve">Hoofdstuk 3</w:t>
+        </w:r>
+      </w:hyperlink>
+      <w:r>
+        <w:rPr>
+          <w:rFonts w:ascii="Arial" w:cs="Arial" w:eastAsia="Arial" w:hAnsi="Arial"/>
+          <w:sz w:val="22"/>
+          <w:szCs w:val="22"/>
+        </w:rPr>
+        <w:t xml:space="preserve"> (Figuur 2) koppelt dit aan de timing: de 18:00-piek is de digitale nabespreking van de springdag, herkenbaar als springer, maar de scherpte ervan verraste me. </w:t>
+      </w:r>
+      <w:hyperlink w:history="1" w:anchor="ch4">
+        <w:r>
+          <w:rPr>
+            <w:rFonts w:ascii="Arial" w:cs="Arial" w:eastAsia="Arial" w:hAnsi="Arial"/>
+            <w:color w:val="1F3864"/>
+            <w:sz w:val="22"/>
+            <w:szCs w:val="22"/>
+            <w:u w:val="single"/>
+          </w:rPr>
+          <w:t xml:space="preserve">Hoofdstuk 4</w:t>
+        </w:r>
+      </w:hyperlink>
+      <w:r>
+        <w:rPr>
+          <w:rFonts w:ascii="Arial" w:cs="Arial" w:eastAsia="Arial" w:hAnsi="Arial"/>
+          <w:sz w:val="22"/>
+          <w:szCs w:val="22"/>
+        </w:rPr>
+        <w:t xml:space="preserve"> (Figuur 3) toont dat een simpel model tekortschiet: drukke uren komen vijftien keer vaker voor dan verwacht. Het dagritme is structureel, niet toevallig.</w:t>
+      </w:r>
+    </w:p>
+    <w:p>
+      <w:pPr>
+        <w:spacing w:after="140"/>
+        <w:jc w:val="both"/>
+      </w:pPr>
+      <w:hyperlink w:history="1" w:anchor="ch5">
+        <w:r>
+          <w:rPr>
+            <w:rFonts w:ascii="Arial" w:cs="Arial" w:eastAsia="Arial" w:hAnsi="Arial"/>
+            <w:color w:val="1F3864"/>
+            <w:sz w:val="22"/>
+            <w:szCs w:val="22"/>
+            <w:u w:val="single"/>
+          </w:rPr>
+          <w:t xml:space="preserve">Hoofdstuk 5</w:t>
+        </w:r>
+      </w:hyperlink>
+      <w:r>
+        <w:rPr>
+          <w:rFonts w:ascii="Arial" w:cs="Arial" w:eastAsia="Arial" w:hAnsi="Arial"/>
+          <w:sz w:val="22"/>
+          <w:szCs w:val="22"/>
+        </w:rPr>
+        <w:t xml:space="preserve"> (Figuur 4) legt de verbinding met incidenten: er is een duidelijk positief verband tussen drukke dagen en incidentactiviteit, maar incidenten zijn niet de enige verklaring voor drukte. </w:t>
+      </w:r>
+      <w:hyperlink w:history="1" w:anchor="ch6">
+        <w:r>
+          <w:rPr>
+            <w:rFonts w:ascii="Arial" w:cs="Arial" w:eastAsia="Arial" w:hAnsi="Arial"/>
+            <w:color w:val="1F3864"/>
+            <w:sz w:val="22"/>
+            <w:szCs w:val="22"/>
+            <w:u w:val="single"/>
+          </w:rPr>
+          <w:t xml:space="preserve">Hoofdstuk 6</w:t>
+        </w:r>
+      </w:hyperlink>
+      <w:r>
+        <w:rPr>
+          <w:rFonts w:ascii="Arial" w:cs="Arial" w:eastAsia="Arial" w:hAnsi="Arial"/>
+          <w:sz w:val="22"/>
+          <w:szCs w:val="22"/>
+        </w:rPr>
+        <w:t xml:space="preserve"> (Figuur 5) levert het meest verrassende en tegelijk moeilijkst te duiden inzicht: de community communiceert sneller bij een incident, maar niet in andere woorden. Wat ik eigenlijk had gehoopt te ontdekken, was of je de verschillende leeftijdsgroepen in de chat kon herkennen aan hun schrijfstijl. Van 20 tot 70 jaar zitten er in de groep heel verschillende mensen. Maar de UMAP laat zien dat er nauwelijks verschil is. De gedeelde taal van de springwereld lijkt sterker dan de leeftijdsverschillen.</w:t>
       </w:r>
     </w:p>
     <w:p>

</xml_diff>

<commit_message>
rapport: add GitHub link to colophon
</commit_message>
<xml_diff>
--- a/WhatsApp_Chatanalyse_Rapport.docx
+++ b/WhatsApp_Chatanalyse_Rapport.docx
@@ -189,7 +189,7 @@
           <w:sz w:val="22"/>
           <w:szCs w:val="22"/>
         </w:rPr>
-        <w:t xml:space="preserve">De dataset omvat 4.143 berichten van 122 unieke afzenders over oktober 2024 tot en met maart 2026. De groep is divers: leeftijden van circa 20 tot 70 jaar, van ervaren instructeurs tot beginners. De chat fungeert als sociaal platform, nieuwsbulletin en veiligheidskanaal tegelijk.</w:t>
+        <w:t xml:space="preserve">De dataset omvat 4.143 berichten van 122 unieke afzenders over oktober 2024 tot en met maart 2026: een periode van 17 maanden met twee volledige vliegseizoen. Het berichtenaantal ligt onder de bovenste richtlijn van 10.000, maar de dataset is rijk door de combinatie van een lange tijdsperiode, 122 actieve deelnemers en verkeer dat drie functies tegelijk dekt: sociaal, operationeel en veiligheidsgerelateerd. Die gelaagdheid maakt het ook met 4.143 berichten mogelijk om patronen te vinden die in een homogenere of kortere chat verborgen zouden blijven.</w:t>
       </w:r>
     </w:p>
     <w:p>
@@ -254,7 +254,7 @@
           <w:sz w:val="22"/>
           <w:szCs w:val="22"/>
         </w:rPr>
-        <w:t xml:space="preserve">De groep telt 154 leden van circa 20 tot 70 jaar: verschillende generaties, verschillende achtergronden, van instructeur tot beginner. Je zou verwachten dat zo'n diverse groep een brede spreiding aan emoji-gebruik laat zien. Dat is niet wat de data laat zien. Bijna driekwart van alle emoji's valt in exact twee categorieën: Positief (41,1%) en Humor (31,0%). De overige categorieën zijn statistisch verwaarloosbaar. 122 actieve afzenders, maar één gedeeld emotioneel register. Die concentratie is alleen zichtbaar als je de verdeling meet; als je door de chat scrolt, zie je variatie. De data zegt iets anders: de community heeft ondanks haar diversiteit een opvallend homogeen emoji-vocabulaire, een teken van gedeelde cultuur.</w:t>
+        <w:t xml:space="preserve">De groep telt 154 leden, waarvan 122 daadwerkelijk berichten stuurden in de meetperiode: verschillende generaties, van circa 20 tot 70 jaar, van instructeur tot beginner. Je zou verwachten dat zo'n diverse groep een brede spreiding aan emoji-gebruik laat zien. Dat is niet wat de data laat zien. Bijna driekwart van alle emoji's valt in exact twee categorieën: Positief (41,1%) en Humor (31,0%). De overige categorieën zijn statistisch verwaarloosbaar. 122 actieve afzenders, maar één gedeeld emotioneel register. Die concentratie is alleen zichtbaar als je de verdeling meet; als je door de chat scrolt, zie je variatie. De data zegt iets anders: de community heeft ondanks haar diversiteit een opvallend homogeen emoji-vocabulaire, een teken van gedeelde cultuur.</w:t>
       </w:r>
     </w:p>
     <w:p>
@@ -953,7 +953,7 @@
           <w:sz w:val="22"/>
           <w:szCs w:val="22"/>
         </w:rPr>
-        <w:t xml:space="preserve">De vergelijking laat een interessant verschil zien. t-SNE, dat lokale structuur maximaliseert, toont de incidentberichten geconcentreerd in de linkerbovenhoek. UMAP, dat ook de globale structuur bewaart, spreidt ze over de hele boog. Welk beeld klopt dan? Ik denk dat UMAP eerlijker is: t-SNE duwt vergelijkbare punten actief naar elkaar toe en vergroot daarmee het schijnbare cluster. UMAP laat zien dat incidentberichten qua schrijfstijl gewoon verspreid zijn door de berichtenwolk, niet gebundeld in een eigen hoek.</w:t>
+        <w:t xml:space="preserve">De vergelijking laat een interessant verschil zien. t-SNE, dat lokale structuur maximaliseert, toont de incidentberichten geconcentreerd in de linkerbovenhoek. UMAP, dat ook de globale structuur bewaart, spreidt ze over de hele boog. Welk beeld klopt dan? Belangrijk om te beseffen is dat de assen zelf geen directe semantische betekenis hebben: zowel bij t-SNE als bij UMAP zijn de coördinaten wiskundige abstracties zonder interpreteerbare eenheid. Wat telt, is de positie van punten ten opzichte van elkaar. In deze configuratie wekt UMAP minder sterk de indruk van een hard cluster dan t-SNE, omdat t-SNE vergelijkbare punten actief naar elkaar toe duwt en daarmee de indruk van clustering kan versterken. Of dat een artefact is of een echte structuur, is niet met zekerheid te zeggen op basis van deze data alleen. Wat wel consistent is: in beide projecties zitten incidentberichten niet duidelijk afgezonderd van de rest.</w:t>
       </w:r>
     </w:p>
     <w:p>
@@ -1298,7 +1298,38 @@
     </w:p>
     <w:p>
       <w:pPr>
-        <w:spacing w:before="320"/>
+        <w:spacing w:after="80" w:before="200"/>
+        <w:jc w:val="center"/>
+      </w:pPr>
+      <w:r>
+        <w:rPr>
+          <w:rFonts w:ascii="Arial" w:cs="Arial" w:eastAsia="Arial" w:hAnsi="Arial"/>
+          <w:i/>
+          <w:iCs/>
+          <w:color w:val="888888"/>
+          <w:sz w:val="18"/>
+          <w:szCs w:val="18"/>
+        </w:rPr>
+        <w:t xml:space="preserve">Code: </w:t>
+      </w:r>
+      <w:hyperlink w:history="1" r:id="rId9mkbymk1va5jsvyvue8ha">
+        <w:r>
+          <w:rPr>
+            <w:rStyle w:val="Hyperlink"/>
+            <w:rFonts w:ascii="Arial" w:cs="Arial" w:eastAsia="Arial" w:hAnsi="Arial"/>
+            <w:i/>
+            <w:iCs/>
+            <w:color w:val="1F5C99"/>
+            <w:sz w:val="18"/>
+            <w:szCs w:val="18"/>
+          </w:rPr>
+          <w:t xml:space="preserve">github.com/Lucas-Joshua/dav-chat-analysis</w:t>
+        </w:r>
+      </w:hyperlink>
+    </w:p>
+    <w:p>
+      <w:pPr>
+        <w:spacing w:before="0"/>
         <w:jc w:val="center"/>
       </w:pPr>
       <w:r>

</xml_diff>

<commit_message>
Final version word document
</commit_message>
<xml_diff>
--- a/WhatsApp_Chatanalyse_Rapport.docx
+++ b/WhatsApp_Chatanalyse_Rapport.docx
@@ -204,6 +204,20 @@
           <w:szCs w:val="22"/>
         </w:rPr>
         <w:t xml:space="preserve">Dit verslag volgt vijf invalshoeken: welke emoji's er worden gebruikt (Les 2), wanneer de chat het drukst is (Les 3), hoe de berichtendrukte is verdeeld over de dag (Les 4), of er een verband is tussen drukke dagen en incidenten (Les 5), en of incidentberichten er inhoudelijk anders uitzien dan gewone berichten (Les 6). Incidenten detecteer ik automatisch op basis van woorden als 'noodlanding', 'gesloten' en 'Airmet': termen die in gewone gesprekken nauwelijks voorkomen.</w:t>
+      </w:r>
+    </w:p>
+    <w:p>
+      <w:pPr>
+        <w:spacing w:after="140"/>
+        <w:jc w:val="both"/>
+      </w:pPr>
+      <w:r>
+        <w:rPr>
+          <w:rFonts w:ascii="Arial" w:cs="Arial" w:eastAsia="Arial" w:hAnsi="Arial"/>
+          <w:sz w:val="22"/>
+          <w:szCs w:val="22"/>
+        </w:rPr>
+        <w:t xml:space="preserve">Voor de analyse zijn aanvullende features geconstrueerd: incident-labels op basis van domeinspecifieke sleutelwoorden en karakter-trigram representaties van berichten, zodat schrijfpatronen los van woordkeuze vergeleken kunnen worden. Alle stappen van preprocessing tot visualisatie zijn geautomatiseerd in een pipeline (zie GitHub), zodat de analyse reproduceerbaar is met één commando.</w:t>
       </w:r>
     </w:p>
     <w:p>
@@ -699,7 +713,7 @@
           <w:sz w:val="22"/>
           <w:szCs w:val="22"/>
         </w:rPr>
-        <w:t xml:space="preserve">Ik heb gekozen voor een overlay van histogram en modelcurven, omdat ik de twee modellen direct naast de werkelijkheid wil laten zien. Twee losse grafieken hadden dezelfde informatie gebracht, maar dan moet de lezer zelf het verschil reconstrueren. Door alles in één plot te zetten, wordt de vergelijking onmiddellijk zichtbaar. Gestalt Gemeenschappelijk lot (Common Fate) speelt hier een rol: de grijze staven en de rode lijn stijgen allebei naar rechts naarmate het uurvolume toeneemt, en dat maakt de relatie instinctief leesbaar.</w:t>
+        <w:t xml:space="preserve">De y-as toont relatieve frequentie (benadering van kans), zodat de waargenomen verdeling direct te vergelijken is met de theoretische Poisson-kansen. Ik heb gekozen voor een overlay van histogram en modelcurven, omdat ik de twee modellen direct naast de werkelijkheid wil laten zien. Twee losse grafieken hadden dezelfde informatie gebracht, maar dan moet de lezer zelf het verschil reconstrueren. Door alles in één plot te zetten, wordt de vergelijking onmiddellijk zichtbaar. Gestalt Gemeenschappelijk lot (Common Fate) speelt hier een rol: de grijze staven en de rode lijn stijgen allebei naar rechts naarmate het uurvolume toeneemt, en dat maakt de relatie instinctief leesbaar.</w:t>
       </w:r>
     </w:p>
     <w:p>
@@ -888,7 +902,7 @@
           <w:sz w:val="22"/>
           <w:szCs w:val="22"/>
         </w:rPr>
-        <w:t xml:space="preserve">Een beperking: een scatterplot toont een verband, maar vertelt niet wat wat veroorzaakt. Gaat de drukte vooraf aan het incident, of volgt hij erop? Dat is een vraag voor vervolgonderzoek. De voetnoot 'observationeel · geen causaliteit' stuurt de interpretatie alvast de goede kant op.</w:t>
+        <w:t xml:space="preserve">Een beperking: een scatterplot toont een verband, maar vertelt niet wat wat veroorzaakt. Gaat de drukte vooraf aan het incident, of volgt hij erop? Dat is een vraag voor vervolgonderzoek. De voetnoot 'observationeel · geen causaliteit' stuurt de interpretatie alvast de goede kant op. Een derde factor, zoals vliegweer, kan tegelijk de chatactiviteit verhogen én het incidentrisico vergroten, zonder dat drukte en incidenten elkaar direct veroorzaken. Dat soort confounding is niet uit te sluiten op basis van correlatie alleen.</w:t>
       </w:r>
     </w:p>
     <w:p>
@@ -1312,7 +1326,7 @@
         </w:rPr>
         <w:t xml:space="preserve">Code: </w:t>
       </w:r>
-      <w:hyperlink w:history="1" r:id="rId9mkbymk1va5jsvyvue8ha">
+      <w:hyperlink w:history="1" r:id="rId4afrtwhoysfnnkd5nwbqs">
         <w:r>
           <w:rPr>
             <w:rStyle w:val="Hyperlink"/>

</xml_diff>

<commit_message>
rapport: spurious correlations consistent per les; README: uv install instructie
</commit_message>
<xml_diff>
--- a/WhatsApp_Chatanalyse_Rapport.docx
+++ b/WhatsApp_Chatanalyse_Rapport.docx
@@ -387,7 +387,7 @@
           <w:sz w:val="22"/>
           <w:szCs w:val="22"/>
         </w:rPr>
-        <w:t xml:space="preserve">Het Gestalt-principe Gelijkenis (Similarity) zorgt ervoor dat vergelijkbare aandelen direct opvallen door vergelijkbare staaflengtes. Figuur/Achtergrond maakt de gekleurde balken zichtbaar op de witte achtergrond. Een beperking: de categorie-indeling is subjectief; een gestandaardiseerde emoji-ontologie zou de classificatie robuuster maken.</w:t>
+        <w:t xml:space="preserve">Het Gestalt-principe Gelijkenis (Similarity) zorgt ervoor dat vergelijkbare aandelen direct opvallen door vergelijkbare staaflengtes. Figuur/Achtergrond maakt de gekleurde balken zichtbaar op de witte achtergrond. Een beperking: de categorie-indeling is subjectief; een gestandaardiseerde emoji-ontologie zou de classificatie robuuster maken. Verder is dit een beschrijvende verdeling: dat Positief en Humor domineren, kan ook komen doordat een klein aantal actieve gebruikers verhoudingsgewijs veel emoji sturen. De grafiek toont het patroon, niet de oorzaak ervan.</w:t>
       </w:r>
     </w:p>
     <w:p>
@@ -557,7 +557,7 @@
           <w:sz w:val="22"/>
           <w:szCs w:val="22"/>
         </w:rPr>
-        <w:t xml:space="preserve">Een beperking: aggregatie over de volledige periode verbergt seizoenspatronen. In de zomer, met langere vliegdagen, zou de piek mogelijk later uitvallen. Een uitsplitsing naar zomer- vs. wintermaanden is een logische vervolgstap.</w:t>
+        <w:t xml:space="preserve">Een beperking: aggregatie over de volledige periode verbergt seizoenspatronen. In de zomer, met langere vliegdagen, zou de piek mogelijk later uitvallen. Een uitsplitsing naar zomer- vs. wintermaanden is een logische vervolgstap. Daarnaast is de koppeling tussen de 18:00-piek en het einde van de springdag een plausibele interpretatie, maar geen bewezen oorzaak. Een alternatieve verklaring is dat 18:00 simpelweg het moment is waarop mensen überhaupt meer vrije tijd hebben, los van springen. Deze data alleen is niet voldoende om die verklaringen van elkaar te onderscheiden.</w:t>
       </w:r>
     </w:p>
     <w:p>
@@ -727,7 +727,7 @@
           <w:sz w:val="22"/>
           <w:szCs w:val="22"/>
         </w:rPr>
-        <w:t xml:space="preserve">Wat ik prettig vond aan deze aanpak: het model is ook visueel intuïtief. De verwachte verdeling heeft een duidelijke vorm, en het verschil met de werkelijkheid is meteen zichtbaar. Een beperking is dat het model ervan uitgaat dat berichten onafhankelijk van elkaar zijn, maar mensen reageren op elkaar, dus er zit ritme in de chat dat het model niet volledig vangt.</w:t>
+        <w:t xml:space="preserve">Wat ik prettig vond aan deze aanpak: het model is ook visueel intuïtief. De verwachte verdeling heeft een duidelijke vorm, en het verschil met de werkelijkheid is meteen zichtbaar. Een beperking is dat het model ervan uitgaat dat berichten onafhankelijk van elkaar zijn, maar mensen reageren op elkaar, dus er zit ritme in de chat dat het model niet volledig vangt. Bovendien toont een betere modelfit alleen dat het tijdsafhankelijke model de data beter beschrijft; het verklaart niet waarom het dagritme bestaat. Andere factoren, zoals werk- of schooltijden die niets met springen te maken hebben, kunnen hetzelfde patroon produceren.</w:t>
       </w:r>
     </w:p>
     <w:p>
@@ -1147,7 +1147,7 @@
           <w:sz w:val="22"/>
           <w:szCs w:val="22"/>
         </w:rPr>
-        <w:t xml:space="preserve">Gestalt Nabijheid (Proximity) is hier de kern: punten dicht bij elkaar hebben een vergelijkbaar schrijfprofiel. Figuur/Achtergrond werkt via kleur: rood steekt af tegen grijs. Dat de incidentberichten in UMAP geen eigen cluster vormen, bevestigt dat de herkenning via specifieke woorden gaat, niet via een andere algemene schrijfstijl.</w:t>
+        <w:t xml:space="preserve">Gestalt Nabijheid (Proximity) is hier de kern: punten dicht bij elkaar hebben een vergelijkbaar schrijfprofiel. Figuur/Achtergrond werkt via kleur: rood steekt af tegen grijs. Dat de incidentberichten in UMAP geen eigen cluster vormen, suggereert dat de herkenning via specifieke woorden gaat, niet via een andere algemene schrijfstijl. Tegelijk is dit een negatief resultaat: afwezigheid van zichtbaar cluster is geen bewijs van afwezigheid van structuur. De karakter-trigrammen zijn mogelijk te grof om fijnere stijlverschillen te detecteren, en een schijnbaar gemengde projectie kan ook het gevolg zijn van de feature-keuze in plaats van de werkelijkheid.</w:t>
       </w:r>
     </w:p>
     <w:p>
@@ -1326,7 +1326,7 @@
         </w:rPr>
         <w:t xml:space="preserve">Code: </w:t>
       </w:r>
-      <w:hyperlink w:history="1" r:id="rId4afrtwhoysfnnkd5nwbqs">
+      <w:hyperlink w:history="1" r:id="rId3ihqupq6fq1sduyakmuf2">
         <w:r>
           <w:rPr>
             <w:rStyle w:val="Hyperlink"/>

</xml_diff>

<commit_message>
rapport: klikbare figuurverwijzingen in conclusie
</commit_message>
<xml_diff>
--- a/WhatsApp_Chatanalyse_Rapport.docx
+++ b/WhatsApp_Chatanalyse_Rapport.docx
@@ -322,6 +322,7 @@
         <w:spacing w:after="220" w:before="60"/>
         <w:jc w:val="center"/>
       </w:pPr>
+      <w:bookmarkStart w:name="[object Object]"/>
       <w:r>
         <w:rPr>
           <w:rFonts w:ascii="Arial" w:cs="Arial" w:eastAsia="Arial" w:hAnsi="Arial"/>
@@ -333,6 +334,7 @@
         </w:rPr>
         <w:t xml:space="preserve">Figuur 1</w:t>
       </w:r>
+      <w:bookmarkEnd w:id="[object Object]"/>
       <w:r>
         <w:rPr>
           <w:rFonts w:ascii="Arial" w:cs="Arial" w:eastAsia="Arial" w:hAnsi="Arial"/>
@@ -492,6 +494,7 @@
         <w:spacing w:after="220" w:before="60"/>
         <w:jc w:val="center"/>
       </w:pPr>
+      <w:bookmarkStart w:name="[object Object]"/>
       <w:r>
         <w:rPr>
           <w:rFonts w:ascii="Arial" w:cs="Arial" w:eastAsia="Arial" w:hAnsi="Arial"/>
@@ -503,6 +506,7 @@
         </w:rPr>
         <w:t xml:space="preserve">Figuur 2</w:t>
       </w:r>
+      <w:bookmarkEnd w:id="[object Object]"/>
       <w:r>
         <w:rPr>
           <w:rFonts w:ascii="Arial" w:cs="Arial" w:eastAsia="Arial" w:hAnsi="Arial"/>
@@ -662,6 +666,7 @@
         <w:spacing w:after="220" w:before="60"/>
         <w:jc w:val="center"/>
       </w:pPr>
+      <w:bookmarkStart w:name="[object Object]"/>
       <w:r>
         <w:rPr>
           <w:rFonts w:ascii="Arial" w:cs="Arial" w:eastAsia="Arial" w:hAnsi="Arial"/>
@@ -673,6 +678,7 @@
         </w:rPr>
         <w:t xml:space="preserve">Figuur 3</w:t>
       </w:r>
+      <w:bookmarkEnd w:id="[object Object]"/>
       <w:r>
         <w:rPr>
           <w:rFonts w:ascii="Arial" w:cs="Arial" w:eastAsia="Arial" w:hAnsi="Arial"/>
@@ -832,6 +838,7 @@
         <w:spacing w:after="220" w:before="60"/>
         <w:jc w:val="center"/>
       </w:pPr>
+      <w:bookmarkStart w:name="[object Object]"/>
       <w:r>
         <w:rPr>
           <w:rFonts w:ascii="Arial" w:cs="Arial" w:eastAsia="Arial" w:hAnsi="Arial"/>
@@ -843,6 +850,7 @@
         </w:rPr>
         <w:t xml:space="preserve">Figuur 4</w:t>
       </w:r>
+      <w:bookmarkEnd w:id="[object Object]"/>
       <w:r>
         <w:rPr>
           <w:rFonts w:ascii="Arial" w:cs="Arial" w:eastAsia="Arial" w:hAnsi="Arial"/>
@@ -1063,6 +1071,7 @@
         <w:spacing w:after="220" w:before="60"/>
         <w:jc w:val="center"/>
       </w:pPr>
+      <w:bookmarkStart w:name="[object Object]"/>
       <w:r>
         <w:rPr>
           <w:rFonts w:ascii="Arial" w:cs="Arial" w:eastAsia="Arial" w:hAnsi="Arial"/>
@@ -1074,6 +1083,7 @@
         </w:rPr>
         <w:t xml:space="preserve">Figuur 5</w:t>
       </w:r>
+      <w:bookmarkEnd w:id="[object Object]"/>
       <w:r>
         <w:rPr>
           <w:rFonts w:ascii="Arial" w:cs="Arial" w:eastAsia="Arial" w:hAnsi="Arial"/>
@@ -1207,7 +1217,27 @@
           <w:sz w:val="22"/>
           <w:szCs w:val="22"/>
         </w:rPr>
-        <w:t xml:space="preserve"> (Figuur 1) laat zien dat de community structureel een luchtige toon heeft: Positief en Humor domineren met meer dan 72% van het emoji-gebruik. </w:t>
+        <w:t xml:space="preserve"> (</w:t>
+      </w:r>
+      <w:hyperlink w:history="1" w:anchor="fig1">
+        <w:r>
+          <w:rPr>
+            <w:rFonts w:ascii="Arial" w:cs="Arial" w:eastAsia="Arial" w:hAnsi="Arial"/>
+            <w:color w:val="1F3864"/>
+            <w:sz w:val="22"/>
+            <w:szCs w:val="22"/>
+            <w:u w:val="single"/>
+          </w:rPr>
+          <w:t xml:space="preserve">Figuur 1</w:t>
+        </w:r>
+      </w:hyperlink>
+      <w:r>
+        <w:rPr>
+          <w:rFonts w:ascii="Arial" w:cs="Arial" w:eastAsia="Arial" w:hAnsi="Arial"/>
+          <w:sz w:val="22"/>
+          <w:szCs w:val="22"/>
+        </w:rPr>
+        <w:t xml:space="preserve">) laat zien dat de community structureel een luchtige toon heeft: Positief en Humor domineren met meer dan 72% van het emoji-gebruik. </w:t>
       </w:r>
       <w:hyperlink w:history="1" w:anchor="ch3">
         <w:r>
@@ -1227,7 +1257,27 @@
           <w:sz w:val="22"/>
           <w:szCs w:val="22"/>
         </w:rPr>
-        <w:t xml:space="preserve"> (Figuur 2) koppelt dit aan de timing: de 18:00-piek is de digitale nabespreking van de springdag, herkenbaar als springer, maar de scherpte ervan verraste me. </w:t>
+        <w:t xml:space="preserve"> (</w:t>
+      </w:r>
+      <w:hyperlink w:history="1" w:anchor="fig2">
+        <w:r>
+          <w:rPr>
+            <w:rFonts w:ascii="Arial" w:cs="Arial" w:eastAsia="Arial" w:hAnsi="Arial"/>
+            <w:color w:val="1F3864"/>
+            <w:sz w:val="22"/>
+            <w:szCs w:val="22"/>
+            <w:u w:val="single"/>
+          </w:rPr>
+          <w:t xml:space="preserve">Figuur 2</w:t>
+        </w:r>
+      </w:hyperlink>
+      <w:r>
+        <w:rPr>
+          <w:rFonts w:ascii="Arial" w:cs="Arial" w:eastAsia="Arial" w:hAnsi="Arial"/>
+          <w:sz w:val="22"/>
+          <w:szCs w:val="22"/>
+        </w:rPr>
+        <w:t xml:space="preserve">) koppelt dit aan de timing: de 18:00-piek is de digitale nabespreking van de springdag, herkenbaar als springer, maar de scherpte ervan verraste me. </w:t>
       </w:r>
       <w:hyperlink w:history="1" w:anchor="ch4">
         <w:r>
@@ -1247,7 +1297,27 @@
           <w:sz w:val="22"/>
           <w:szCs w:val="22"/>
         </w:rPr>
-        <w:t xml:space="preserve"> (Figuur 3) toont dat een simpel model tekortschiet: drukke uren komen vijftien keer vaker voor dan verwacht. Het dagritme is structureel, niet toevallig.</w:t>
+        <w:t xml:space="preserve"> (</w:t>
+      </w:r>
+      <w:hyperlink w:history="1" w:anchor="fig3">
+        <w:r>
+          <w:rPr>
+            <w:rFonts w:ascii="Arial" w:cs="Arial" w:eastAsia="Arial" w:hAnsi="Arial"/>
+            <w:color w:val="1F3864"/>
+            <w:sz w:val="22"/>
+            <w:szCs w:val="22"/>
+            <w:u w:val="single"/>
+          </w:rPr>
+          <w:t xml:space="preserve">Figuur 3</w:t>
+        </w:r>
+      </w:hyperlink>
+      <w:r>
+        <w:rPr>
+          <w:rFonts w:ascii="Arial" w:cs="Arial" w:eastAsia="Arial" w:hAnsi="Arial"/>
+          <w:sz w:val="22"/>
+          <w:szCs w:val="22"/>
+        </w:rPr>
+        <w:t xml:space="preserve">) toont dat een simpel model tekortschiet: drukke uren komen vijftien keer vaker voor dan verwacht. Het dagritme is structureel, niet toevallig.</w:t>
       </w:r>
     </w:p>
     <w:p>
@@ -1273,7 +1343,27 @@
           <w:sz w:val="22"/>
           <w:szCs w:val="22"/>
         </w:rPr>
-        <w:t xml:space="preserve"> (Figuur 4) legt de verbinding met incidenten: er is een duidelijk positief verband tussen drukke dagen en incidentactiviteit, maar incidenten zijn niet de enige verklaring voor drukte. </w:t>
+        <w:t xml:space="preserve"> (</w:t>
+      </w:r>
+      <w:hyperlink w:history="1" w:anchor="fig4">
+        <w:r>
+          <w:rPr>
+            <w:rFonts w:ascii="Arial" w:cs="Arial" w:eastAsia="Arial" w:hAnsi="Arial"/>
+            <w:color w:val="1F3864"/>
+            <w:sz w:val="22"/>
+            <w:szCs w:val="22"/>
+            <w:u w:val="single"/>
+          </w:rPr>
+          <w:t xml:space="preserve">Figuur 4</w:t>
+        </w:r>
+      </w:hyperlink>
+      <w:r>
+        <w:rPr>
+          <w:rFonts w:ascii="Arial" w:cs="Arial" w:eastAsia="Arial" w:hAnsi="Arial"/>
+          <w:sz w:val="22"/>
+          <w:szCs w:val="22"/>
+        </w:rPr>
+        <w:t xml:space="preserve">) legt de verbinding met incidenten: er is een duidelijk positief verband tussen drukke dagen en incidentactiviteit, maar incidenten zijn niet de enige verklaring voor drukte. </w:t>
       </w:r>
       <w:hyperlink w:history="1" w:anchor="ch6">
         <w:r>
@@ -1293,7 +1383,27 @@
           <w:sz w:val="22"/>
           <w:szCs w:val="22"/>
         </w:rPr>
-        <w:t xml:space="preserve"> (Figuur 5) levert het meest verrassende en tegelijk moeilijkst te duiden inzicht: de community communiceert sneller bij een incident, maar niet in andere woorden. Wat ik eigenlijk had gehoopt te ontdekken, was of je de verschillende leeftijdsgroepen in de chat kon herkennen aan hun schrijfstijl. Van 20 tot 70 jaar zitten er in de groep heel verschillende mensen. Maar de UMAP laat zien dat er nauwelijks verschil is. De gedeelde taal van de springwereld lijkt sterker dan de leeftijdsverschillen.</w:t>
+        <w:t xml:space="preserve"> (</w:t>
+      </w:r>
+      <w:hyperlink w:history="1" w:anchor="fig5">
+        <w:r>
+          <w:rPr>
+            <w:rFonts w:ascii="Arial" w:cs="Arial" w:eastAsia="Arial" w:hAnsi="Arial"/>
+            <w:color w:val="1F3864"/>
+            <w:sz w:val="22"/>
+            <w:szCs w:val="22"/>
+            <w:u w:val="single"/>
+          </w:rPr>
+          <w:t xml:space="preserve">Figuur 5</w:t>
+        </w:r>
+      </w:hyperlink>
+      <w:r>
+        <w:rPr>
+          <w:rFonts w:ascii="Arial" w:cs="Arial" w:eastAsia="Arial" w:hAnsi="Arial"/>
+          <w:sz w:val="22"/>
+          <w:szCs w:val="22"/>
+        </w:rPr>
+        <w:t xml:space="preserve">) levert het meest verrassende en tegelijk moeilijkst te duiden inzicht: de community communiceert sneller bij een incident, maar niet in andere woorden. Wat ik eigenlijk had gehoopt te ontdekken, was of je de verschillende leeftijdsgroepen in de chat kon herkennen aan hun schrijfstijl. Van 20 tot 70 jaar zitten er in de groep heel verschillende mensen. Maar de UMAP laat zien dat er nauwelijks verschil is. De gedeelde taal van de springwereld lijkt sterker dan de leeftijdsverschillen.</w:t>
       </w:r>
     </w:p>
     <w:p>
@@ -1326,7 +1436,7 @@
         </w:rPr>
         <w:t xml:space="preserve">Code: </w:t>
       </w:r>
-      <w:hyperlink w:history="1" r:id="rId3ihqupq6fq1sduyakmuf2">
+      <w:hyperlink w:history="1" r:id="rIdcvcxx3hyysrdxaftbgfwj">
         <w:r>
           <w:rPr>
             <w:rStyle w:val="Hyperlink"/>

</xml_diff>

<commit_message>
rapport: fix interne hyperlinks (BookmarkStart v9 API); voeg PDF toe
</commit_message>
<xml_diff>
--- a/WhatsApp_Chatanalyse_Rapport.docx
+++ b/WhatsApp_Chatanalyse_Rapport.docx
@@ -150,7 +150,7 @@
         <w:pageBreakBefore/>
         <w:spacing w:after="120" w:before="280"/>
       </w:pPr>
-      <w:bookmarkStart w:name="[object Object]"/>
+      <w:bookmarkStart w:name="ch1" w:id="0"/>
       <w:r>
         <w:rPr>
           <w:rFonts w:ascii="Arial" w:cs="Arial" w:eastAsia="Arial" w:hAnsi="Arial"/>
@@ -162,7 +162,7 @@
         </w:rPr>
         <w:t xml:space="preserve">1  Inleiding</w:t>
       </w:r>
-      <w:bookmarkEnd w:id="[object Object]"/>
+      <w:bookmarkEnd w:id="0"/>
     </w:p>
     <w:p>
       <w:pPr>
@@ -226,7 +226,7 @@
         <w:pageBreakBefore/>
         <w:spacing w:after="120" w:before="280"/>
       </w:pPr>
-      <w:bookmarkStart w:name="[object Object]"/>
+      <w:bookmarkStart w:name="ch2" w:id="1"/>
       <w:r>
         <w:rPr>
           <w:rFonts w:ascii="Arial" w:cs="Arial" w:eastAsia="Arial" w:hAnsi="Arial"/>
@@ -238,7 +238,7 @@
         </w:rPr>
         <w:t xml:space="preserve">2  Categorische visualisatie</w:t>
       </w:r>
-      <w:bookmarkEnd w:id="[object Object]"/>
+      <w:bookmarkEnd w:id="1"/>
     </w:p>
     <w:p>
       <w:pPr>
@@ -322,7 +322,7 @@
         <w:spacing w:after="220" w:before="60"/>
         <w:jc w:val="center"/>
       </w:pPr>
-      <w:bookmarkStart w:name="[object Object]"/>
+      <w:bookmarkStart w:name="fig1" w:id="2"/>
       <w:r>
         <w:rPr>
           <w:rFonts w:ascii="Arial" w:cs="Arial" w:eastAsia="Arial" w:hAnsi="Arial"/>
@@ -334,7 +334,7 @@
         </w:rPr>
         <w:t xml:space="preserve">Figuur 1</w:t>
       </w:r>
-      <w:bookmarkEnd w:id="[object Object]"/>
+      <w:bookmarkEnd w:id="2"/>
       <w:r>
         <w:rPr>
           <w:rFonts w:ascii="Arial" w:cs="Arial" w:eastAsia="Arial" w:hAnsi="Arial"/>
@@ -398,7 +398,7 @@
         <w:pageBreakBefore/>
         <w:spacing w:after="120" w:before="280"/>
       </w:pPr>
-      <w:bookmarkStart w:name="[object Object]"/>
+      <w:bookmarkStart w:name="ch3" w:id="3"/>
       <w:r>
         <w:rPr>
           <w:rFonts w:ascii="Arial" w:cs="Arial" w:eastAsia="Arial" w:hAnsi="Arial"/>
@@ -410,7 +410,7 @@
         </w:rPr>
         <w:t xml:space="preserve">3  Tijdreeksanalyse</w:t>
       </w:r>
-      <w:bookmarkEnd w:id="[object Object]"/>
+      <w:bookmarkEnd w:id="3"/>
     </w:p>
     <w:p>
       <w:pPr>
@@ -494,7 +494,7 @@
         <w:spacing w:after="220" w:before="60"/>
         <w:jc w:val="center"/>
       </w:pPr>
-      <w:bookmarkStart w:name="[object Object]"/>
+      <w:bookmarkStart w:name="fig2" w:id="4"/>
       <w:r>
         <w:rPr>
           <w:rFonts w:ascii="Arial" w:cs="Arial" w:eastAsia="Arial" w:hAnsi="Arial"/>
@@ -506,7 +506,7 @@
         </w:rPr>
         <w:t xml:space="preserve">Figuur 2</w:t>
       </w:r>
-      <w:bookmarkEnd w:id="[object Object]"/>
+      <w:bookmarkEnd w:id="4"/>
       <w:r>
         <w:rPr>
           <w:rFonts w:ascii="Arial" w:cs="Arial" w:eastAsia="Arial" w:hAnsi="Arial"/>
@@ -570,7 +570,7 @@
         <w:pageBreakBefore/>
         <w:spacing w:after="120" w:before="280"/>
       </w:pPr>
-      <w:bookmarkStart w:name="[object Object]"/>
+      <w:bookmarkStart w:name="ch4" w:id="5"/>
       <w:r>
         <w:rPr>
           <w:rFonts w:ascii="Arial" w:cs="Arial" w:eastAsia="Arial" w:hAnsi="Arial"/>
@@ -582,7 +582,7 @@
         </w:rPr>
         <w:t xml:space="preserve">4  Distributievisualisatie</w:t>
       </w:r>
-      <w:bookmarkEnd w:id="[object Object]"/>
+      <w:bookmarkEnd w:id="5"/>
     </w:p>
     <w:p>
       <w:pPr>
@@ -666,7 +666,7 @@
         <w:spacing w:after="220" w:before="60"/>
         <w:jc w:val="center"/>
       </w:pPr>
-      <w:bookmarkStart w:name="[object Object]"/>
+      <w:bookmarkStart w:name="fig3" w:id="6"/>
       <w:r>
         <w:rPr>
           <w:rFonts w:ascii="Arial" w:cs="Arial" w:eastAsia="Arial" w:hAnsi="Arial"/>
@@ -678,7 +678,7 @@
         </w:rPr>
         <w:t xml:space="preserve">Figuur 3</w:t>
       </w:r>
-      <w:bookmarkEnd w:id="[object Object]"/>
+      <w:bookmarkEnd w:id="6"/>
       <w:r>
         <w:rPr>
           <w:rFonts w:ascii="Arial" w:cs="Arial" w:eastAsia="Arial" w:hAnsi="Arial"/>
@@ -742,7 +742,7 @@
         <w:pageBreakBefore/>
         <w:spacing w:after="120" w:before="280"/>
       </w:pPr>
-      <w:bookmarkStart w:name="[object Object]"/>
+      <w:bookmarkStart w:name="ch5" w:id="7"/>
       <w:r>
         <w:rPr>
           <w:rFonts w:ascii="Arial" w:cs="Arial" w:eastAsia="Arial" w:hAnsi="Arial"/>
@@ -754,7 +754,7 @@
         </w:rPr>
         <w:t xml:space="preserve">5  Relatievisualisatie</w:t>
       </w:r>
-      <w:bookmarkEnd w:id="[object Object]"/>
+      <w:bookmarkEnd w:id="7"/>
     </w:p>
     <w:p>
       <w:pPr>
@@ -838,7 +838,7 @@
         <w:spacing w:after="220" w:before="60"/>
         <w:jc w:val="center"/>
       </w:pPr>
-      <w:bookmarkStart w:name="[object Object]"/>
+      <w:bookmarkStart w:name="fig4" w:id="8"/>
       <w:r>
         <w:rPr>
           <w:rFonts w:ascii="Arial" w:cs="Arial" w:eastAsia="Arial" w:hAnsi="Arial"/>
@@ -850,7 +850,7 @@
         </w:rPr>
         <w:t xml:space="preserve">Figuur 4</w:t>
       </w:r>
-      <w:bookmarkEnd w:id="[object Object]"/>
+      <w:bookmarkEnd w:id="8"/>
       <w:r>
         <w:rPr>
           <w:rFonts w:ascii="Arial" w:cs="Arial" w:eastAsia="Arial" w:hAnsi="Arial"/>
@@ -919,7 +919,7 @@
         <w:pageBreakBefore/>
         <w:spacing w:after="120" w:before="280"/>
       </w:pPr>
-      <w:bookmarkStart w:name="[object Object]"/>
+      <w:bookmarkStart w:name="ch6" w:id="9"/>
       <w:r>
         <w:rPr>
           <w:rFonts w:ascii="Arial" w:cs="Arial" w:eastAsia="Arial" w:hAnsi="Arial"/>
@@ -931,7 +931,7 @@
         </w:rPr>
         <w:t xml:space="preserve">6  Dimensiereductie</w:t>
       </w:r>
-      <w:bookmarkEnd w:id="[object Object]"/>
+      <w:bookmarkEnd w:id="9"/>
     </w:p>
     <w:p>
       <w:pPr>
@@ -1071,7 +1071,7 @@
         <w:spacing w:after="220" w:before="60"/>
         <w:jc w:val="center"/>
       </w:pPr>
-      <w:bookmarkStart w:name="[object Object]"/>
+      <w:bookmarkStart w:name="fig5" w:id="10"/>
       <w:r>
         <w:rPr>
           <w:rFonts w:ascii="Arial" w:cs="Arial" w:eastAsia="Arial" w:hAnsi="Arial"/>
@@ -1083,7 +1083,7 @@
         </w:rPr>
         <w:t xml:space="preserve">Figuur 5</w:t>
       </w:r>
-      <w:bookmarkEnd w:id="[object Object]"/>
+      <w:bookmarkEnd w:id="10"/>
       <w:r>
         <w:rPr>
           <w:rFonts w:ascii="Arial" w:cs="Arial" w:eastAsia="Arial" w:hAnsi="Arial"/>
@@ -1166,7 +1166,7 @@
         <w:pageBreakBefore/>
         <w:spacing w:after="120" w:before="280"/>
       </w:pPr>
-      <w:bookmarkStart w:name="[object Object]"/>
+      <w:bookmarkStart w:name="ch7" w:id="11"/>
       <w:r>
         <w:rPr>
           <w:rFonts w:ascii="Arial" w:cs="Arial" w:eastAsia="Arial" w:hAnsi="Arial"/>
@@ -1178,7 +1178,7 @@
         </w:rPr>
         <w:t xml:space="preserve">7  Conclusie</w:t>
       </w:r>
-      <w:bookmarkEnd w:id="[object Object]"/>
+      <w:bookmarkEnd w:id="11"/>
     </w:p>
     <w:p>
       <w:pPr>
@@ -1436,7 +1436,7 @@
         </w:rPr>
         <w:t xml:space="preserve">Code: </w:t>
       </w:r>
-      <w:hyperlink w:history="1" r:id="rIdcvcxx3hyysrdxaftbgfwj">
+      <w:hyperlink w:history="1" r:id="rIddbfo1dfcl9vlguvh_y39h">
         <w:r>
           <w:rPr>
             <w:rStyle w:val="Hyperlink"/>

</xml_diff>

<commit_message>
rapport: handmatige inhoudsopgave met klikbare links; 4.2 nieuwe pagina
</commit_message>
<xml_diff>
--- a/WhatsApp_Chatanalyse_Rapport.docx
+++ b/WhatsApp_Chatanalyse_Rapport.docx
@@ -125,25 +125,321 @@
         <w:br w:type="page"/>
       </w:r>
     </w:p>
-    <w:sdt>
-      <w:sdtPr>
-        <w:alias w:val="Inhoudsopgave"/>
-      </w:sdtPr>
-      <w:sdtContent>
-        <w:p>
-          <w:r>
-            <w:fldChar w:fldCharType="begin" w:dirty="true"/>
-            <w:instrText xml:space="preserve">TOC \h \o "1-2" \t "Heading1,1,Heading2,2"</w:instrText>
-            <w:fldChar w:fldCharType="separate"/>
-          </w:r>
-        </w:p>
-        <w:p>
-          <w:r>
-            <w:fldChar w:fldCharType="end"/>
-          </w:r>
-        </w:p>
-      </w:sdtContent>
-    </w:sdt>
+    <w:p>
+      <w:pPr>
+        <w:pBdr>
+          <w:bottom w:val="single" w:color="CCCCCC" w:sz="4" w:space="1"/>
+        </w:pBdr>
+        <w:spacing w:after="200" w:before="0"/>
+      </w:pPr>
+      <w:r>
+        <w:rPr>
+          <w:rFonts w:ascii="Arial" w:cs="Arial" w:eastAsia="Arial" w:hAnsi="Arial"/>
+          <w:b/>
+          <w:bCs/>
+          <w:color w:val="1F3864"/>
+          <w:sz w:val="28"/>
+          <w:szCs w:val="28"/>
+        </w:rPr>
+        <w:t xml:space="preserve">Inhoudsopgave</w:t>
+      </w:r>
+    </w:p>
+    <w:p>
+      <w:pPr>
+        <w:spacing w:after="50" w:before="100"/>
+      </w:pPr>
+      <w:hyperlink w:history="1" w:anchor="ch1">
+        <w:r>
+          <w:rPr>
+            <w:rFonts w:ascii="Arial" w:cs="Arial" w:eastAsia="Arial" w:hAnsi="Arial"/>
+            <w:b/>
+            <w:bCs/>
+            <w:color w:val="1F3864"/>
+            <w:sz w:val="22"/>
+            <w:szCs w:val="22"/>
+          </w:rPr>
+          <w:t xml:space="preserve">1  Inleiding</w:t>
+        </w:r>
+      </w:hyperlink>
+    </w:p>
+    <w:p>
+      <w:pPr>
+        <w:spacing w:after="50" w:before="100"/>
+      </w:pPr>
+      <w:hyperlink w:history="1" w:anchor="ch2">
+        <w:r>
+          <w:rPr>
+            <w:rFonts w:ascii="Arial" w:cs="Arial" w:eastAsia="Arial" w:hAnsi="Arial"/>
+            <w:b/>
+            <w:bCs/>
+            <w:color w:val="1F3864"/>
+            <w:sz w:val="22"/>
+            <w:szCs w:val="22"/>
+          </w:rPr>
+          <w:t xml:space="preserve">2  Categorische visualisatie</w:t>
+        </w:r>
+      </w:hyperlink>
+    </w:p>
+    <w:p>
+      <w:pPr>
+        <w:spacing w:after="30" w:before="30"/>
+        <w:ind w:left="440"/>
+      </w:pPr>
+      <w:hyperlink w:history="1" w:anchor="ch2s1">
+        <w:r>
+          <w:rPr>
+            <w:rFonts w:ascii="Arial" w:cs="Arial" w:eastAsia="Arial" w:hAnsi="Arial"/>
+            <w:color w:val="2E4D7B"/>
+            <w:sz w:val="21"/>
+            <w:szCs w:val="21"/>
+          </w:rPr>
+          <w:t xml:space="preserve">2.1  Emoji-gebruik per categorie</w:t>
+        </w:r>
+      </w:hyperlink>
+    </w:p>
+    <w:p>
+      <w:pPr>
+        <w:spacing w:after="30" w:before="30"/>
+        <w:ind w:left="440"/>
+      </w:pPr>
+      <w:hyperlink w:history="1" w:anchor="ch2s2">
+        <w:r>
+          <w:rPr>
+            <w:rFonts w:ascii="Arial" w:cs="Arial" w:eastAsia="Arial" w:hAnsi="Arial"/>
+            <w:color w:val="2E4D7B"/>
+            <w:sz w:val="21"/>
+            <w:szCs w:val="21"/>
+          </w:rPr>
+          <w:t xml:space="preserve">2.2  Reflectie</w:t>
+        </w:r>
+      </w:hyperlink>
+    </w:p>
+    <w:p>
+      <w:pPr>
+        <w:spacing w:after="50" w:before="100"/>
+      </w:pPr>
+      <w:hyperlink w:history="1" w:anchor="ch3">
+        <w:r>
+          <w:rPr>
+            <w:rFonts w:ascii="Arial" w:cs="Arial" w:eastAsia="Arial" w:hAnsi="Arial"/>
+            <w:b/>
+            <w:bCs/>
+            <w:color w:val="1F3864"/>
+            <w:sz w:val="22"/>
+            <w:szCs w:val="22"/>
+          </w:rPr>
+          <w:t xml:space="preserve">3  Tijdreeksanalyse</w:t>
+        </w:r>
+      </w:hyperlink>
+    </w:p>
+    <w:p>
+      <w:pPr>
+        <w:spacing w:after="30" w:before="30"/>
+        <w:ind w:left="440"/>
+      </w:pPr>
+      <w:hyperlink w:history="1" w:anchor="ch3s1">
+        <w:r>
+          <w:rPr>
+            <w:rFonts w:ascii="Arial" w:cs="Arial" w:eastAsia="Arial" w:hAnsi="Arial"/>
+            <w:color w:val="2E4D7B"/>
+            <w:sz w:val="21"/>
+            <w:szCs w:val="21"/>
+          </w:rPr>
+          <w:t xml:space="preserve">3.1  Chatactiviteit per uur van de dag</w:t>
+        </w:r>
+      </w:hyperlink>
+    </w:p>
+    <w:p>
+      <w:pPr>
+        <w:spacing w:after="30" w:before="30"/>
+        <w:ind w:left="440"/>
+      </w:pPr>
+      <w:hyperlink w:history="1" w:anchor="ch3s2">
+        <w:r>
+          <w:rPr>
+            <w:rFonts w:ascii="Arial" w:cs="Arial" w:eastAsia="Arial" w:hAnsi="Arial"/>
+            <w:color w:val="2E4D7B"/>
+            <w:sz w:val="21"/>
+            <w:szCs w:val="21"/>
+          </w:rPr>
+          <w:t xml:space="preserve">3.2  Reflectie</w:t>
+        </w:r>
+      </w:hyperlink>
+    </w:p>
+    <w:p>
+      <w:pPr>
+        <w:spacing w:after="50" w:before="100"/>
+      </w:pPr>
+      <w:hyperlink w:history="1" w:anchor="ch4">
+        <w:r>
+          <w:rPr>
+            <w:rFonts w:ascii="Arial" w:cs="Arial" w:eastAsia="Arial" w:hAnsi="Arial"/>
+            <w:b/>
+            <w:bCs/>
+            <w:color w:val="1F3864"/>
+            <w:sz w:val="22"/>
+            <w:szCs w:val="22"/>
+          </w:rPr>
+          <w:t xml:space="preserve">4  Distributievisualisatie</w:t>
+        </w:r>
+      </w:hyperlink>
+    </w:p>
+    <w:p>
+      <w:pPr>
+        <w:spacing w:after="30" w:before="30"/>
+        <w:ind w:left="440"/>
+      </w:pPr>
+      <w:hyperlink w:history="1" w:anchor="ch4s1">
+        <w:r>
+          <w:rPr>
+            <w:rFonts w:ascii="Arial" w:cs="Arial" w:eastAsia="Arial" w:hAnsi="Arial"/>
+            <w:color w:val="2E4D7B"/>
+            <w:sz w:val="21"/>
+            <w:szCs w:val="21"/>
+          </w:rPr>
+          <w:t xml:space="preserve">4.1  Poisson-model: globaal versus tijdsafhankelijk</w:t>
+        </w:r>
+      </w:hyperlink>
+    </w:p>
+    <w:p>
+      <w:pPr>
+        <w:spacing w:after="30" w:before="30"/>
+        <w:ind w:left="440"/>
+      </w:pPr>
+      <w:hyperlink w:history="1" w:anchor="ch4s2">
+        <w:r>
+          <w:rPr>
+            <w:rFonts w:ascii="Arial" w:cs="Arial" w:eastAsia="Arial" w:hAnsi="Arial"/>
+            <w:color w:val="2E4D7B"/>
+            <w:sz w:val="21"/>
+            <w:szCs w:val="21"/>
+          </w:rPr>
+          <w:t xml:space="preserve">4.2  Reflectie</w:t>
+        </w:r>
+      </w:hyperlink>
+    </w:p>
+    <w:p>
+      <w:pPr>
+        <w:spacing w:after="50" w:before="100"/>
+      </w:pPr>
+      <w:hyperlink w:history="1" w:anchor="ch5">
+        <w:r>
+          <w:rPr>
+            <w:rFonts w:ascii="Arial" w:cs="Arial" w:eastAsia="Arial" w:hAnsi="Arial"/>
+            <w:b/>
+            <w:bCs/>
+            <w:color w:val="1F3864"/>
+            <w:sz w:val="22"/>
+            <w:szCs w:val="22"/>
+          </w:rPr>
+          <w:t xml:space="preserve">5  Relatievisualisatie</w:t>
+        </w:r>
+      </w:hyperlink>
+    </w:p>
+    <w:p>
+      <w:pPr>
+        <w:spacing w:after="30" w:before="30"/>
+        <w:ind w:left="440"/>
+      </w:pPr>
+      <w:hyperlink w:history="1" w:anchor="ch5s1">
+        <w:r>
+          <w:rPr>
+            <w:rFonts w:ascii="Arial" w:cs="Arial" w:eastAsia="Arial" w:hAnsi="Arial"/>
+            <w:color w:val="2E4D7B"/>
+            <w:sz w:val="21"/>
+            <w:szCs w:val="21"/>
+          </w:rPr>
+          <w:t xml:space="preserve">5.1  Correlatie dagelijks volume en incidentactiviteit</w:t>
+        </w:r>
+      </w:hyperlink>
+    </w:p>
+    <w:p>
+      <w:pPr>
+        <w:spacing w:after="30" w:before="30"/>
+        <w:ind w:left="440"/>
+      </w:pPr>
+      <w:hyperlink w:history="1" w:anchor="ch5s2">
+        <w:r>
+          <w:rPr>
+            <w:rFonts w:ascii="Arial" w:cs="Arial" w:eastAsia="Arial" w:hAnsi="Arial"/>
+            <w:color w:val="2E4D7B"/>
+            <w:sz w:val="21"/>
+            <w:szCs w:val="21"/>
+          </w:rPr>
+          <w:t xml:space="preserve">5.2  Reflectie</w:t>
+        </w:r>
+      </w:hyperlink>
+    </w:p>
+    <w:p>
+      <w:pPr>
+        <w:spacing w:after="50" w:before="100"/>
+      </w:pPr>
+      <w:hyperlink w:history="1" w:anchor="ch6">
+        <w:r>
+          <w:rPr>
+            <w:rFonts w:ascii="Arial" w:cs="Arial" w:eastAsia="Arial" w:hAnsi="Arial"/>
+            <w:b/>
+            <w:bCs/>
+            <w:color w:val="1F3864"/>
+            <w:sz w:val="22"/>
+            <w:szCs w:val="22"/>
+          </w:rPr>
+          <w:t xml:space="preserve">6  Dimensiereductie</w:t>
+        </w:r>
+      </w:hyperlink>
+    </w:p>
+    <w:p>
+      <w:pPr>
+        <w:spacing w:after="30" w:before="30"/>
+        <w:ind w:left="440"/>
+      </w:pPr>
+      <w:hyperlink w:history="1" w:anchor="ch6s1">
+        <w:r>
+          <w:rPr>
+            <w:rFonts w:ascii="Arial" w:cs="Arial" w:eastAsia="Arial" w:hAnsi="Arial"/>
+            <w:color w:val="2E4D7B"/>
+            <w:sz w:val="21"/>
+            <w:szCs w:val="21"/>
+          </w:rPr>
+          <w:t xml:space="preserve">6.1  t-SNE en UMAP vergeleken</w:t>
+        </w:r>
+      </w:hyperlink>
+    </w:p>
+    <w:p>
+      <w:pPr>
+        <w:spacing w:after="30" w:before="30"/>
+        <w:ind w:left="440"/>
+      </w:pPr>
+      <w:hyperlink w:history="1" w:anchor="ch6s2">
+        <w:r>
+          <w:rPr>
+            <w:rFonts w:ascii="Arial" w:cs="Arial" w:eastAsia="Arial" w:hAnsi="Arial"/>
+            <w:color w:val="2E4D7B"/>
+            <w:sz w:val="21"/>
+            <w:szCs w:val="21"/>
+          </w:rPr>
+          <w:t xml:space="preserve">6.2  Reflectie</w:t>
+        </w:r>
+      </w:hyperlink>
+    </w:p>
+    <w:p>
+      <w:pPr>
+        <w:spacing w:after="50" w:before="100"/>
+      </w:pPr>
+      <w:hyperlink w:history="1" w:anchor="ch7">
+        <w:r>
+          <w:rPr>
+            <w:rFonts w:ascii="Arial" w:cs="Arial" w:eastAsia="Arial" w:hAnsi="Arial"/>
+            <w:b/>
+            <w:bCs/>
+            <w:color w:val="1F3864"/>
+            <w:sz w:val="22"/>
+            <w:szCs w:val="22"/>
+          </w:rPr>
+          <w:t xml:space="preserve">7  Conclusie</w:t>
+        </w:r>
+      </w:hyperlink>
+    </w:p>
     <w:p>
       <w:pPr>
         <w:pStyle w:val="Heading1"/>
@@ -245,6 +541,7 @@
         <w:pStyle w:val="Heading2"/>
         <w:spacing w:after="100" w:before="200"/>
       </w:pPr>
+      <w:bookmarkStart w:name="ch2s1" w:id="2"/>
       <w:r>
         <w:rPr>
           <w:rFonts w:ascii="Arial" w:cs="Arial" w:eastAsia="Arial" w:hAnsi="Arial"/>
@@ -256,6 +553,7 @@
         </w:rPr>
         <w:t xml:space="preserve">2.1  Emoji-gebruik per categorie</w:t>
       </w:r>
+      <w:bookmarkEnd w:id="2"/>
     </w:p>
     <w:p>
       <w:pPr>
@@ -322,7 +620,7 @@
         <w:spacing w:after="220" w:before="60"/>
         <w:jc w:val="center"/>
       </w:pPr>
-      <w:bookmarkStart w:name="fig1" w:id="2"/>
+      <w:bookmarkStart w:name="fig1" w:id="3"/>
       <w:r>
         <w:rPr>
           <w:rFonts w:ascii="Arial" w:cs="Arial" w:eastAsia="Arial" w:hAnsi="Arial"/>
@@ -334,7 +632,7 @@
         </w:rPr>
         <w:t xml:space="preserve">Figuur 1</w:t>
       </w:r>
-      <w:bookmarkEnd w:id="2"/>
+      <w:bookmarkEnd w:id="3"/>
       <w:r>
         <w:rPr>
           <w:rFonts w:ascii="Arial" w:cs="Arial" w:eastAsia="Arial" w:hAnsi="Arial"/>
@@ -352,6 +650,7 @@
         <w:pStyle w:val="Heading2"/>
         <w:spacing w:after="100" w:before="200"/>
       </w:pPr>
+      <w:bookmarkStart w:name="ch2s2" w:id="4"/>
       <w:r>
         <w:rPr>
           <w:rFonts w:ascii="Arial" w:cs="Arial" w:eastAsia="Arial" w:hAnsi="Arial"/>
@@ -363,6 +662,7 @@
         </w:rPr>
         <w:t xml:space="preserve">2.2  Reflectie</w:t>
       </w:r>
+      <w:bookmarkEnd w:id="4"/>
     </w:p>
     <w:p>
       <w:pPr>
@@ -398,7 +698,7 @@
         <w:pageBreakBefore/>
         <w:spacing w:after="120" w:before="280"/>
       </w:pPr>
-      <w:bookmarkStart w:name="ch3" w:id="3"/>
+      <w:bookmarkStart w:name="ch3" w:id="5"/>
       <w:r>
         <w:rPr>
           <w:rFonts w:ascii="Arial" w:cs="Arial" w:eastAsia="Arial" w:hAnsi="Arial"/>
@@ -410,13 +710,14 @@
         </w:rPr>
         <w:t xml:space="preserve">3  Tijdreeksanalyse</w:t>
       </w:r>
-      <w:bookmarkEnd w:id="3"/>
+      <w:bookmarkEnd w:id="5"/>
     </w:p>
     <w:p>
       <w:pPr>
         <w:pStyle w:val="Heading2"/>
         <w:spacing w:after="100" w:before="200"/>
       </w:pPr>
+      <w:bookmarkStart w:name="ch3s1" w:id="6"/>
       <w:r>
         <w:rPr>
           <w:rFonts w:ascii="Arial" w:cs="Arial" w:eastAsia="Arial" w:hAnsi="Arial"/>
@@ -428,6 +729,7 @@
         </w:rPr>
         <w:t xml:space="preserve">3.1  Chatactiviteit per uur van de dag</w:t>
       </w:r>
+      <w:bookmarkEnd w:id="6"/>
     </w:p>
     <w:p>
       <w:pPr>
@@ -494,7 +796,7 @@
         <w:spacing w:after="220" w:before="60"/>
         <w:jc w:val="center"/>
       </w:pPr>
-      <w:bookmarkStart w:name="fig2" w:id="4"/>
+      <w:bookmarkStart w:name="fig2" w:id="7"/>
       <w:r>
         <w:rPr>
           <w:rFonts w:ascii="Arial" w:cs="Arial" w:eastAsia="Arial" w:hAnsi="Arial"/>
@@ -506,7 +808,7 @@
         </w:rPr>
         <w:t xml:space="preserve">Figuur 2</w:t>
       </w:r>
-      <w:bookmarkEnd w:id="4"/>
+      <w:bookmarkEnd w:id="7"/>
       <w:r>
         <w:rPr>
           <w:rFonts w:ascii="Arial" w:cs="Arial" w:eastAsia="Arial" w:hAnsi="Arial"/>
@@ -524,6 +826,7 @@
         <w:pStyle w:val="Heading2"/>
         <w:spacing w:after="100" w:before="200"/>
       </w:pPr>
+      <w:bookmarkStart w:name="ch3s2" w:id="8"/>
       <w:r>
         <w:rPr>
           <w:rFonts w:ascii="Arial" w:cs="Arial" w:eastAsia="Arial" w:hAnsi="Arial"/>
@@ -535,6 +838,7 @@
         </w:rPr>
         <w:t xml:space="preserve">3.2  Reflectie</w:t>
       </w:r>
+      <w:bookmarkEnd w:id="8"/>
     </w:p>
     <w:p>
       <w:pPr>
@@ -570,7 +874,7 @@
         <w:pageBreakBefore/>
         <w:spacing w:after="120" w:before="280"/>
       </w:pPr>
-      <w:bookmarkStart w:name="ch4" w:id="5"/>
+      <w:bookmarkStart w:name="ch4" w:id="9"/>
       <w:r>
         <w:rPr>
           <w:rFonts w:ascii="Arial" w:cs="Arial" w:eastAsia="Arial" w:hAnsi="Arial"/>
@@ -582,13 +886,14 @@
         </w:rPr>
         <w:t xml:space="preserve">4  Distributievisualisatie</w:t>
       </w:r>
-      <w:bookmarkEnd w:id="5"/>
+      <w:bookmarkEnd w:id="9"/>
     </w:p>
     <w:p>
       <w:pPr>
         <w:pStyle w:val="Heading2"/>
         <w:spacing w:after="100" w:before="200"/>
       </w:pPr>
+      <w:bookmarkStart w:name="ch4s1" w:id="10"/>
       <w:r>
         <w:rPr>
           <w:rFonts w:ascii="Arial" w:cs="Arial" w:eastAsia="Arial" w:hAnsi="Arial"/>
@@ -600,6 +905,7 @@
         </w:rPr>
         <w:t xml:space="preserve">4.1  Poisson-model: globaal versus tijdsafhankelijk</w:t>
       </w:r>
+      <w:bookmarkEnd w:id="10"/>
     </w:p>
     <w:p>
       <w:pPr>
@@ -666,7 +972,7 @@
         <w:spacing w:after="220" w:before="60"/>
         <w:jc w:val="center"/>
       </w:pPr>
-      <w:bookmarkStart w:name="fig3" w:id="6"/>
+      <w:bookmarkStart w:name="fig3" w:id="11"/>
       <w:r>
         <w:rPr>
           <w:rFonts w:ascii="Arial" w:cs="Arial" w:eastAsia="Arial" w:hAnsi="Arial"/>
@@ -678,7 +984,7 @@
         </w:rPr>
         <w:t xml:space="preserve">Figuur 3</w:t>
       </w:r>
-      <w:bookmarkEnd w:id="6"/>
+      <w:bookmarkEnd w:id="11"/>
       <w:r>
         <w:rPr>
           <w:rFonts w:ascii="Arial" w:cs="Arial" w:eastAsia="Arial" w:hAnsi="Arial"/>
@@ -692,10 +998,16 @@
       </w:r>
     </w:p>
     <w:p>
+      <w:r>
+        <w:br w:type="page"/>
+      </w:r>
+    </w:p>
+    <w:p>
       <w:pPr>
         <w:pStyle w:val="Heading2"/>
         <w:spacing w:after="100" w:before="200"/>
       </w:pPr>
+      <w:bookmarkStart w:name="ch4s2" w:id="12"/>
       <w:r>
         <w:rPr>
           <w:rFonts w:ascii="Arial" w:cs="Arial" w:eastAsia="Arial" w:hAnsi="Arial"/>
@@ -707,6 +1019,7 @@
         </w:rPr>
         <w:t xml:space="preserve">4.2  Reflectie</w:t>
       </w:r>
+      <w:bookmarkEnd w:id="12"/>
     </w:p>
     <w:p>
       <w:pPr>
@@ -742,7 +1055,7 @@
         <w:pageBreakBefore/>
         <w:spacing w:after="120" w:before="280"/>
       </w:pPr>
-      <w:bookmarkStart w:name="ch5" w:id="7"/>
+      <w:bookmarkStart w:name="ch5" w:id="13"/>
       <w:r>
         <w:rPr>
           <w:rFonts w:ascii="Arial" w:cs="Arial" w:eastAsia="Arial" w:hAnsi="Arial"/>
@@ -754,13 +1067,14 @@
         </w:rPr>
         <w:t xml:space="preserve">5  Relatievisualisatie</w:t>
       </w:r>
-      <w:bookmarkEnd w:id="7"/>
+      <w:bookmarkEnd w:id="13"/>
     </w:p>
     <w:p>
       <w:pPr>
         <w:pStyle w:val="Heading2"/>
         <w:spacing w:after="100" w:before="200"/>
       </w:pPr>
+      <w:bookmarkStart w:name="ch5s1" w:id="14"/>
       <w:r>
         <w:rPr>
           <w:rFonts w:ascii="Arial" w:cs="Arial" w:eastAsia="Arial" w:hAnsi="Arial"/>
@@ -772,6 +1086,7 @@
         </w:rPr>
         <w:t xml:space="preserve">5.1  Correlatie dagelijks volume en incidentactiviteit</w:t>
       </w:r>
+      <w:bookmarkEnd w:id="14"/>
     </w:p>
     <w:p>
       <w:pPr>
@@ -838,7 +1153,7 @@
         <w:spacing w:after="220" w:before="60"/>
         <w:jc w:val="center"/>
       </w:pPr>
-      <w:bookmarkStart w:name="fig4" w:id="8"/>
+      <w:bookmarkStart w:name="fig4" w:id="15"/>
       <w:r>
         <w:rPr>
           <w:rFonts w:ascii="Arial" w:cs="Arial" w:eastAsia="Arial" w:hAnsi="Arial"/>
@@ -850,7 +1165,7 @@
         </w:rPr>
         <w:t xml:space="preserve">Figuur 4</w:t>
       </w:r>
-      <w:bookmarkEnd w:id="8"/>
+      <w:bookmarkEnd w:id="15"/>
       <w:r>
         <w:rPr>
           <w:rFonts w:ascii="Arial" w:cs="Arial" w:eastAsia="Arial" w:hAnsi="Arial"/>
@@ -873,6 +1188,7 @@
         <w:pStyle w:val="Heading2"/>
         <w:spacing w:after="100" w:before="200"/>
       </w:pPr>
+      <w:bookmarkStart w:name="ch5s2" w:id="16"/>
       <w:r>
         <w:rPr>
           <w:rFonts w:ascii="Arial" w:cs="Arial" w:eastAsia="Arial" w:hAnsi="Arial"/>
@@ -884,6 +1200,7 @@
         </w:rPr>
         <w:t xml:space="preserve">5.2  Reflectie</w:t>
       </w:r>
+      <w:bookmarkEnd w:id="16"/>
     </w:p>
     <w:p>
       <w:pPr>
@@ -919,7 +1236,7 @@
         <w:pageBreakBefore/>
         <w:spacing w:after="120" w:before="280"/>
       </w:pPr>
-      <w:bookmarkStart w:name="ch6" w:id="9"/>
+      <w:bookmarkStart w:name="ch6" w:id="17"/>
       <w:r>
         <w:rPr>
           <w:rFonts w:ascii="Arial" w:cs="Arial" w:eastAsia="Arial" w:hAnsi="Arial"/>
@@ -931,13 +1248,14 @@
         </w:rPr>
         <w:t xml:space="preserve">6  Dimensiereductie</w:t>
       </w:r>
-      <w:bookmarkEnd w:id="9"/>
+      <w:bookmarkEnd w:id="17"/>
     </w:p>
     <w:p>
       <w:pPr>
         <w:pStyle w:val="Heading2"/>
         <w:spacing w:after="100" w:before="200"/>
       </w:pPr>
+      <w:bookmarkStart w:name="ch6s1" w:id="18"/>
       <w:r>
         <w:rPr>
           <w:rFonts w:ascii="Arial" w:cs="Arial" w:eastAsia="Arial" w:hAnsi="Arial"/>
@@ -949,6 +1267,7 @@
         </w:rPr>
         <w:t xml:space="preserve">6.1  t-SNE en UMAP vergeleken</w:t>
       </w:r>
+      <w:bookmarkEnd w:id="18"/>
     </w:p>
     <w:p>
       <w:pPr>
@@ -1071,7 +1390,7 @@
         <w:spacing w:after="220" w:before="60"/>
         <w:jc w:val="center"/>
       </w:pPr>
-      <w:bookmarkStart w:name="fig5" w:id="10"/>
+      <w:bookmarkStart w:name="fig5" w:id="19"/>
       <w:r>
         <w:rPr>
           <w:rFonts w:ascii="Arial" w:cs="Arial" w:eastAsia="Arial" w:hAnsi="Arial"/>
@@ -1083,7 +1402,7 @@
         </w:rPr>
         <w:t xml:space="preserve">Figuur 5</w:t>
       </w:r>
-      <w:bookmarkEnd w:id="10"/>
+      <w:bookmarkEnd w:id="19"/>
       <w:r>
         <w:rPr>
           <w:rFonts w:ascii="Arial" w:cs="Arial" w:eastAsia="Arial" w:hAnsi="Arial"/>
@@ -1106,6 +1425,7 @@
         <w:pStyle w:val="Heading2"/>
         <w:spacing w:after="100" w:before="200"/>
       </w:pPr>
+      <w:bookmarkStart w:name="ch6s2" w:id="20"/>
       <w:r>
         <w:rPr>
           <w:rFonts w:ascii="Arial" w:cs="Arial" w:eastAsia="Arial" w:hAnsi="Arial"/>
@@ -1117,6 +1437,7 @@
         </w:rPr>
         <w:t xml:space="preserve">6.2  Reflectie</w:t>
       </w:r>
+      <w:bookmarkEnd w:id="20"/>
     </w:p>
     <w:p>
       <w:pPr>
@@ -1166,7 +1487,7 @@
         <w:pageBreakBefore/>
         <w:spacing w:after="120" w:before="280"/>
       </w:pPr>
-      <w:bookmarkStart w:name="ch7" w:id="11"/>
+      <w:bookmarkStart w:name="ch7" w:id="21"/>
       <w:r>
         <w:rPr>
           <w:rFonts w:ascii="Arial" w:cs="Arial" w:eastAsia="Arial" w:hAnsi="Arial"/>
@@ -1178,7 +1499,7 @@
         </w:rPr>
         <w:t xml:space="preserve">7  Conclusie</w:t>
       </w:r>
-      <w:bookmarkEnd w:id="11"/>
+      <w:bookmarkEnd w:id="21"/>
     </w:p>
     <w:p>
       <w:pPr>
@@ -1436,7 +1757,7 @@
         </w:rPr>
         <w:t xml:space="preserve">Code: </w:t>
       </w:r>
-      <w:hyperlink w:history="1" r:id="rIddbfo1dfcl9vlguvh_y39h">
+      <w:hyperlink w:history="1" r:id="rIdm-xfksopbsc6xl9lxteds">
         <w:r>
           <w:rPr>
             <w:rStyle w:val="Hyperlink"/>

</xml_diff>